<commit_message>
Add scroll reveal animations, global cursor-pointer, card hover effects, and UI polish
</commit_message>
<xml_diff>
--- a/FISTO_Project_Analysis_Report.docx
+++ b/FISTO_Project_Analysis_Report.docx
@@ -2,12 +2,6 @@
 <file path=word/document.xml><?xml version="1.0" encoding="utf-8"?>
 <w:document xmlns:wpc="http://schemas.microsoft.com/office/word/2010/wordprocessingCanvas" xmlns:mo="http://schemas.microsoft.com/office/mac/office/2008/main" xmlns:mc="http://schemas.openxmlformats.org/markup-compatibility/2006" xmlns:mv="urn:schemas-microsoft-com:mac:vml" xmlns:o="urn:schemas-microsoft-com:office:office" xmlns:r="http://schemas.openxmlformats.org/officeDocument/2006/relationships" xmlns:m="http://schemas.openxmlformats.org/officeDocument/2006/math" xmlns:v="urn:schemas-microsoft-com:vml" xmlns:wp14="http://schemas.microsoft.com/office/word/2010/wordprocessingDrawing" xmlns:wp="http://schemas.openxmlformats.org/drawingml/2006/wordprocessingDrawing" xmlns:w10="urn:schemas-microsoft-com:office:word" xmlns:w="http://schemas.openxmlformats.org/wordprocessingml/2006/main" xmlns:w14="http://schemas.microsoft.com/office/word/2010/wordml" xmlns:wpg="http://schemas.microsoft.com/office/word/2010/wordprocessingGroup" xmlns:wpi="http://schemas.microsoft.com/office/word/2010/wordprocessingInk" xmlns:wne="http://schemas.microsoft.com/office/word/2006/wordml" xmlns:wps="http://schemas.microsoft.com/office/word/2010/wordprocessingShape" mc:Ignorable="w14 wp14">
   <w:body>
-    <w:p/>
-    <w:p/>
-    <w:p/>
-    <w:p/>
-    <w:p/>
-    <w:p/>
     <w:p>
       <w:pPr>
         <w:jc w:val="center"/>
@@ -15,8 +9,8 @@
       <w:r>
         <w:rPr>
           <w:b/>
-          <w:color w:val="1A1A2E"/>
-          <w:sz w:val="64"/>
+          <w:color w:val="1E1E1E"/>
+          <w:sz w:val="40"/>
         </w:rPr>
         <w:t>FISTO E-Commerce Website</w:t>
       </w:r>
@@ -27,907 +21,42 @@
       </w:pPr>
       <w:r>
         <w:rPr>
-          <w:color w:val="666666"/>
-          <w:sz w:val="36"/>
+          <w:sz w:val="22"/>
         </w:rPr>
-        <w:t>Complete Project Analysis Report</w:t>
+        <w:t>Technical Architecture &amp; How It Works — Compact Analysis Report</w:t>
       </w:r>
     </w:p>
     <w:p/>
     <w:p>
       <w:pPr>
-        <w:jc w:val="center"/>
+        <w:pStyle w:val="Heading1"/>
       </w:pPr>
       <w:r>
         <w:rPr>
-          <w:i/>
-          <w:color w:val="888888"/>
-          <w:sz w:val="24"/>
+          <w:color w:val="143C8C"/>
         </w:rPr>
-        <w:t>A Modern Premium E-Commerce Experience</w:t>
-      </w:r>
-    </w:p>
-    <w:p/>
-    <w:p/>
-    <w:p>
-      <w:pPr>
-        <w:jc w:val="center"/>
-      </w:pPr>
-      <w:r>
-        <w:rPr>
-          <w:color w:val="999999"/>
-          <w:sz w:val="22"/>
-        </w:rPr>
-        <w:t>Generated on: July 07, 2026</w:t>
+        <w:t>1. Overview</w:t>
       </w:r>
     </w:p>
     <w:p>
       <w:r>
-        <w:br w:type="page"/>
+        <w:rPr>
+          <w:b w:val="0"/>
+          <w:sz w:val="20"/>
+        </w:rPr>
+        <w:t>FISTO is a production-ready, SEO-first e-commerce frontend built with Next.js 16 (App Router) and TypeScript. It uses a mock data layer to simulate a real product catalog, cart, auth, and checkout system — ready to be wired to any backend or headless CMS.</w:t>
       </w:r>
     </w:p>
+    <w:p/>
     <w:p>
       <w:pPr>
         <w:pStyle w:val="Heading1"/>
       </w:pPr>
       <w:r>
-        <w:t>Table of Contents</w:t>
-      </w:r>
-    </w:p>
-    <w:p>
-      <w:pPr>
-        <w:pBdr>
-          <w:bottom w:val="single" w:sz="6" w:space="1" w:color="999999"/>
-        </w:pBdr>
-      </w:pPr>
-    </w:p>
-    <w:p>
-      <w:r>
         <w:rPr>
-          <w:sz w:val="22"/>
+          <w:color w:val="143C8C"/>
         </w:rPr>
-        <w:t>1.  What Is This Project? (The Big Picture)</w:t>
-      </w:r>
-    </w:p>
-    <w:p>
-      <w:r>
-        <w:rPr>
-          <w:sz w:val="22"/>
-        </w:rPr>
-        <w:t>2.  The Toolbox: Technologies Used</w:t>
-      </w:r>
-    </w:p>
-    <w:p>
-      <w:r>
-        <w:rPr>
-          <w:sz w:val="22"/>
-        </w:rPr>
-        <w:t>3.  How the Website Is Organized (File Structure)</w:t>
-      </w:r>
-    </w:p>
-    <w:p>
-      <w:r>
-        <w:rPr>
-          <w:sz w:val="22"/>
-        </w:rPr>
-        <w:t>4.  The Pages: Where Users Go</w:t>
-      </w:r>
-    </w:p>
-    <w:p>
-      <w:r>
-        <w:rPr>
-          <w:sz w:val="22"/>
-        </w:rPr>
-        <w:t>5.  The Building Blocks: Components</w:t>
-      </w:r>
-    </w:p>
-    <w:p>
-      <w:r>
-        <w:rPr>
-          <w:sz w:val="22"/>
-        </w:rPr>
-        <w:t>6.  How Data Flows: State Management</w:t>
-      </w:r>
-    </w:p>
-    <w:p>
-      <w:r>
-        <w:rPr>
-          <w:sz w:val="22"/>
-        </w:rPr>
-        <w:t>7.  The Brain Behind the Scenes: API Services</w:t>
-      </w:r>
-    </w:p>
-    <w:p>
-      <w:r>
-        <w:rPr>
-          <w:sz w:val="22"/>
-        </w:rPr>
-        <w:t>8.  How the Website Looks: Styling &amp; Design</w:t>
-      </w:r>
-    </w:p>
-    <w:p>
-      <w:r>
-        <w:rPr>
-          <w:sz w:val="22"/>
-        </w:rPr>
-        <w:t>9.  How It All Connects: Architecture Diagram</w:t>
-      </w:r>
-    </w:p>
-    <w:p>
-      <w:r>
-        <w:rPr>
-          <w:sz w:val="22"/>
-        </w:rPr>
-        <w:t>10.  Special Features &amp; Cool Things It Does</w:t>
-      </w:r>
-    </w:p>
-    <w:p>
-      <w:r>
-        <w:rPr>
-          <w:sz w:val="22"/>
-        </w:rPr>
-        <w:t>11.  Security &amp; SEO: Being Found and Protected</w:t>
-      </w:r>
-    </w:p>
-    <w:p>
-      <w:r>
-        <w:rPr>
-          <w:sz w:val="22"/>
-        </w:rPr>
-        <w:t>12.  Summary: Everything at a Glance</w:t>
-      </w:r>
-    </w:p>
-    <w:p>
-      <w:r>
-        <w:br w:type="page"/>
-      </w:r>
-    </w:p>
-    <w:p>
-      <w:pPr>
-        <w:pStyle w:val="Heading1"/>
-      </w:pPr>
-      <w:r>
-        <w:t>1. What Is This Project? (The Big Picture)</w:t>
-      </w:r>
-    </w:p>
-    <w:p>
-      <w:pPr>
-        <w:pBdr>
-          <w:bottom w:val="single" w:sz="6" w:space="1" w:color="999999"/>
-        </w:pBdr>
-      </w:pPr>
-    </w:p>
-    <w:p>
-      <w:r>
-        <w:t>FISTO is a complete online shopping website — imagine an Amazon or Shopify, but smaller, prettier, and built just for premium tech products like headphones, smartwatches, keyboards, and cool desk accessories.</w:t>
-      </w:r>
-    </w:p>
-    <w:p>
-      <w:r>
-        <w:t>Think of it like a digital store that lives on the internet. Customers can browse products, add things to their shopping bag, and buy them — all from their computer or phone. Behind the scenes, a lot of clever computer code makes all of this work smoothly.</w:t>
-      </w:r>
-    </w:p>
-    <w:p>
-      <w:r>
-        <w:rPr>
-          <w:b/>
-          <w:sz w:val="22"/>
-        </w:rPr>
-        <w:t xml:space="preserve">In technical terms: </w:t>
-      </w:r>
-      <w:r>
-        <w:t>This is a full-stack e-commerce application built with Next.js (a React framework for building websites), using TypeScript for type-safe code, Tailwind CSS for styling, and Zustand for managing application state. It features server-side rendering (SSR), static site generation (SSG), API routes, and a component-based architecture.</w:t>
-      </w:r>
-    </w:p>
-    <w:p>
-      <w:pPr>
-        <w:pStyle w:val="Heading2"/>
-      </w:pPr>
-      <w:r>
-        <w:t>What Can Users Do on This Website?</w:t>
-      </w:r>
-    </w:p>
-    <w:tbl>
-      <w:tblPr>
-        <w:tblStyle w:val="TableGrid"/>
-        <w:tblW w:type="auto" w:w="0"/>
-        <w:jc w:val="center"/>
-        <w:tblLook w:firstColumn="1" w:firstRow="1" w:lastColumn="0" w:lastRow="0" w:noHBand="0" w:noVBand="1" w:val="04A0"/>
-      </w:tblPr>
-      <w:tblGrid>
-        <w:gridCol w:w="4703"/>
-        <w:gridCol w:w="4703"/>
-      </w:tblGrid>
-      <w:tr>
-        <w:tc>
-          <w:tcPr>
-            <w:tcW w:type="dxa" w:w="4703"/>
-            <w:shd w:fill="1a1a2e" w:val="clear"/>
-          </w:tcPr>
-          <w:p>
-            <w:r>
-              <w:rPr>
-                <w:b/>
-                <w:color w:val="FFFFFF"/>
-              </w:rPr>
-              <w:t>Feature</w:t>
-            </w:r>
-          </w:p>
-        </w:tc>
-        <w:tc>
-          <w:tcPr>
-            <w:tcW w:type="dxa" w:w="4703"/>
-            <w:shd w:fill="1a1a2e" w:val="clear"/>
-          </w:tcPr>
-          <w:p>
-            <w:r>
-              <w:rPr>
-                <w:b/>
-                <w:color w:val="FFFFFF"/>
-              </w:rPr>
-              <w:t>What It Means</w:t>
-            </w:r>
-          </w:p>
-        </w:tc>
-      </w:tr>
-      <w:tr>
-        <w:tc>
-          <w:tcPr>
-            <w:tcW w:type="dxa" w:w="4703"/>
-          </w:tcPr>
-          <w:p>
-            <w:r>
-              <w:t>Browse Products</w:t>
-            </w:r>
-          </w:p>
-        </w:tc>
-        <w:tc>
-          <w:tcPr>
-            <w:tcW w:type="dxa" w:w="4703"/>
-          </w:tcPr>
-          <w:p>
-            <w:r>
-              <w:t>Look through a catalog of headphones, watches, keyboards, bags, and more</w:t>
-            </w:r>
-          </w:p>
-        </w:tc>
-      </w:tr>
-      <w:tr>
-        <w:tc>
-          <w:tcPr>
-            <w:tcW w:type="dxa" w:w="4703"/>
-            <w:shd w:fill="f5f5f5" w:val="clear"/>
-          </w:tcPr>
-          <w:p>
-            <w:r>
-              <w:t>Search Products</w:t>
-            </w:r>
-          </w:p>
-        </w:tc>
-        <w:tc>
-          <w:tcPr>
-            <w:tcW w:type="dxa" w:w="4703"/>
-            <w:shd w:fill="f5f5f5" w:val="clear"/>
-          </w:tcPr>
-          <w:p>
-            <w:r>
-              <w:t>Type keywords to find exactly what you want</w:t>
-            </w:r>
-          </w:p>
-        </w:tc>
-      </w:tr>
-      <w:tr>
-        <w:tc>
-          <w:tcPr>
-            <w:tcW w:type="dxa" w:w="4703"/>
-          </w:tcPr>
-          <w:p>
-            <w:r>
-              <w:t>Filter &amp; Sort</w:t>
-            </w:r>
-          </w:p>
-        </w:tc>
-        <w:tc>
-          <w:tcPr>
-            <w:tcW w:type="dxa" w:w="4703"/>
-          </w:tcPr>
-          <w:p>
-            <w:r>
-              <w:t>Narrow down products by category, brand, price, or rating</w:t>
-            </w:r>
-          </w:p>
-        </w:tc>
-      </w:tr>
-      <w:tr>
-        <w:tc>
-          <w:tcPr>
-            <w:tcW w:type="dxa" w:w="4703"/>
-            <w:shd w:fill="f5f5f5" w:val="clear"/>
-          </w:tcPr>
-          <w:p>
-            <w:r>
-              <w:t>View Product Details</w:t>
-            </w:r>
-          </w:p>
-        </w:tc>
-        <w:tc>
-          <w:tcPr>
-            <w:tcW w:type="dxa" w:w="4703"/>
-            <w:shd w:fill="f5f5f5" w:val="clear"/>
-          </w:tcPr>
-          <w:p>
-            <w:r>
-              <w:t>See big photos, read descriptions, check specs, and read reviews</w:t>
-            </w:r>
-          </w:p>
-        </w:tc>
-      </w:tr>
-      <w:tr>
-        <w:tc>
-          <w:tcPr>
-            <w:tcW w:type="dxa" w:w="4703"/>
-          </w:tcPr>
-          <w:p>
-            <w:r>
-              <w:t>Add to Shopping Bag</w:t>
-            </w:r>
-          </w:p>
-        </w:tc>
-        <w:tc>
-          <w:tcPr>
-            <w:tcW w:type="dxa" w:w="4703"/>
-          </w:tcPr>
-          <w:p>
-            <w:r>
-              <w:t>Put items in a virtual shopping cart to buy later</w:t>
-            </w:r>
-          </w:p>
-        </w:tc>
-      </w:tr>
-      <w:tr>
-        <w:tc>
-          <w:tcPr>
-            <w:tcW w:type="dxa" w:w="4703"/>
-            <w:shd w:fill="f5f5f5" w:val="clear"/>
-          </w:tcPr>
-          <w:p>
-            <w:r>
-              <w:t>Wishlist</w:t>
-            </w:r>
-          </w:p>
-        </w:tc>
-        <w:tc>
-          <w:tcPr>
-            <w:tcW w:type="dxa" w:w="4703"/>
-            <w:shd w:fill="f5f5f5" w:val="clear"/>
-          </w:tcPr>
-          <w:p>
-            <w:r>
-              <w:t>Save items you like for later — like bookmarking a product</w:t>
-            </w:r>
-          </w:p>
-        </w:tc>
-      </w:tr>
-      <w:tr>
-        <w:tc>
-          <w:tcPr>
-            <w:tcW w:type="dxa" w:w="4703"/>
-          </w:tcPr>
-          <w:p>
-            <w:r>
-              <w:t>Apply Discount Codes</w:t>
-            </w:r>
-          </w:p>
-        </w:tc>
-        <w:tc>
-          <w:tcPr>
-            <w:tcW w:type="dxa" w:w="4703"/>
-          </w:tcPr>
-          <w:p>
-            <w:r>
-              <w:t>Use coupon codes like "FISTO10" to get money off</w:t>
-            </w:r>
-          </w:p>
-        </w:tc>
-      </w:tr>
-      <w:tr>
-        <w:tc>
-          <w:tcPr>
-            <w:tcW w:type="dxa" w:w="4703"/>
-            <w:shd w:fill="f5f5f5" w:val="clear"/>
-          </w:tcPr>
-          <w:p>
-            <w:r>
-              <w:t>Checkout &amp; Pay</w:t>
-            </w:r>
-          </w:p>
-        </w:tc>
-        <w:tc>
-          <w:tcPr>
-            <w:tcW w:type="dxa" w:w="4703"/>
-            <w:shd w:fill="f5f5f5" w:val="clear"/>
-          </w:tcPr>
-          <w:p>
-            <w:r>
-              <w:t>Enter your address and payment info to place an order</w:t>
-            </w:r>
-          </w:p>
-        </w:tc>
-      </w:tr>
-      <w:tr>
-        <w:tc>
-          <w:tcPr>
-            <w:tcW w:type="dxa" w:w="4703"/>
-          </w:tcPr>
-          <w:p>
-            <w:r>
-              <w:t>User Account</w:t>
-            </w:r>
-          </w:p>
-        </w:tc>
-        <w:tc>
-          <w:tcPr>
-            <w:tcW w:type="dxa" w:w="4703"/>
-          </w:tcPr>
-          <w:p>
-            <w:r>
-              <w:t>Log in, register, view order history, and manage your profile</w:t>
-            </w:r>
-          </w:p>
-        </w:tc>
-      </w:tr>
-      <w:tr>
-        <w:tc>
-          <w:tcPr>
-            <w:tcW w:type="dxa" w:w="4703"/>
-            <w:shd w:fill="f5f5f5" w:val="clear"/>
-          </w:tcPr>
-          <w:p>
-            <w:r>
-              <w:t>Admin Dashboard</w:t>
-            </w:r>
-          </w:p>
-        </w:tc>
-        <w:tc>
-          <w:tcPr>
-            <w:tcW w:type="dxa" w:w="4703"/>
-            <w:shd w:fill="f5f5f5" w:val="clear"/>
-          </w:tcPr>
-          <w:p>
-            <w:r>
-              <w:t>See sales stats, recent orders, and manage the store</w:t>
-            </w:r>
-          </w:p>
-        </w:tc>
-      </w:tr>
-    </w:tbl>
-    <w:p>
-      <w:r>
-        <w:br w:type="page"/>
-      </w:r>
-    </w:p>
-    <w:p>
-      <w:pPr>
-        <w:pStyle w:val="Heading1"/>
-      </w:pPr>
-      <w:r>
-        <w:t>2. The Toolbox: Technologies Used</w:t>
-      </w:r>
-    </w:p>
-    <w:p>
-      <w:pPr>
-        <w:pBdr>
-          <w:bottom w:val="single" w:sz="6" w:space="1" w:color="999999"/>
-        </w:pBdr>
-      </w:pPr>
-    </w:p>
-    <w:p>
-      <w:r>
-        <w:t>Every website is built using tools — like how you build a house with bricks, wood, and cement. Here are the tools (called "technologies") used to build FISTO:</w:t>
-      </w:r>
-    </w:p>
-    <w:tbl>
-      <w:tblPr>
-        <w:tblStyle w:val="TableGrid"/>
-        <w:tblW w:type="auto" w:w="0"/>
-        <w:jc w:val="center"/>
-        <w:tblLook w:firstColumn="1" w:firstRow="1" w:lastColumn="0" w:lastRow="0" w:noHBand="0" w:noVBand="1" w:val="04A0"/>
-      </w:tblPr>
-      <w:tblGrid>
-        <w:gridCol w:w="3135"/>
-        <w:gridCol w:w="3135"/>
-        <w:gridCol w:w="3135"/>
-      </w:tblGrid>
-      <w:tr>
-        <w:tc>
-          <w:tcPr>
-            <w:tcW w:type="dxa" w:w="3135"/>
-            <w:shd w:fill="1a1a2e" w:val="clear"/>
-          </w:tcPr>
-          <w:p>
-            <w:r>
-              <w:rPr>
-                <w:b/>
-                <w:color w:val="FFFFFF"/>
-              </w:rPr>
-              <w:t>Technology</w:t>
-            </w:r>
-          </w:p>
-        </w:tc>
-        <w:tc>
-          <w:tcPr>
-            <w:tcW w:type="dxa" w:w="3135"/>
-            <w:shd w:fill="1a1a2e" w:val="clear"/>
-          </w:tcPr>
-          <w:p>
-            <w:r>
-              <w:rPr>
-                <w:b/>
-                <w:color w:val="FFFFFF"/>
-              </w:rPr>
-              <w:t>What It Is</w:t>
-            </w:r>
-          </w:p>
-        </w:tc>
-        <w:tc>
-          <w:tcPr>
-            <w:tcW w:type="dxa" w:w="3135"/>
-            <w:shd w:fill="1a1a2e" w:val="clear"/>
-          </w:tcPr>
-          <w:p>
-            <w:r>
-              <w:rPr>
-                <w:b/>
-                <w:color w:val="FFFFFF"/>
-              </w:rPr>
-              <w:t>Why It's Used</w:t>
-            </w:r>
-          </w:p>
-        </w:tc>
-      </w:tr>
-      <w:tr>
-        <w:tc>
-          <w:tcPr>
-            <w:tcW w:type="dxa" w:w="3135"/>
-          </w:tcPr>
-          <w:p>
-            <w:r>
-              <w:t>Next.js 16</w:t>
-            </w:r>
-          </w:p>
-        </w:tc>
-        <w:tc>
-          <w:tcPr>
-            <w:tcW w:type="dxa" w:w="3135"/>
-          </w:tcPr>
-          <w:p>
-            <w:r>
-              <w:t>A framework for building websites with React</w:t>
-            </w:r>
-          </w:p>
-        </w:tc>
-        <w:tc>
-          <w:tcPr>
-            <w:tcW w:type="dxa" w:w="3135"/>
-          </w:tcPr>
-          <w:p>
-            <w:r>
-              <w:t>Makes pages load fast, handles both server and client code, and organizes the website into pages automatically</w:t>
-            </w:r>
-          </w:p>
-        </w:tc>
-      </w:tr>
-      <w:tr>
-        <w:tc>
-          <w:tcPr>
-            <w:tcW w:type="dxa" w:w="3135"/>
-            <w:shd w:fill="f5f5f5" w:val="clear"/>
-          </w:tcPr>
-          <w:p>
-            <w:r>
-              <w:t>React 19</w:t>
-            </w:r>
-          </w:p>
-        </w:tc>
-        <w:tc>
-          <w:tcPr>
-            <w:tcW w:type="dxa" w:w="3135"/>
-            <w:shd w:fill="f5f5f5" w:val="clear"/>
-          </w:tcPr>
-          <w:p>
-            <w:r>
-              <w:t>A library for building user interfaces</w:t>
-            </w:r>
-          </w:p>
-        </w:tc>
-        <w:tc>
-          <w:tcPr>
-            <w:tcW w:type="dxa" w:w="3135"/>
-            <w:shd w:fill="f5f5f5" w:val="clear"/>
-          </w:tcPr>
-          <w:p>
-            <w:r>
-              <w:t>Lets developers build interactive buttons, forms, and displays that update instantly without reloading the page</w:t>
-            </w:r>
-          </w:p>
-        </w:tc>
-      </w:tr>
-      <w:tr>
-        <w:tc>
-          <w:tcPr>
-            <w:tcW w:type="dxa" w:w="3135"/>
-          </w:tcPr>
-          <w:p>
-            <w:r>
-              <w:t>TypeScript</w:t>
-            </w:r>
-          </w:p>
-        </w:tc>
-        <w:tc>
-          <w:tcPr>
-            <w:tcW w:type="dxa" w:w="3135"/>
-          </w:tcPr>
-          <w:p>
-            <w:r>
-              <w:t>A strict version of JavaScript</w:t>
-            </w:r>
-          </w:p>
-        </w:tc>
-        <w:tc>
-          <w:tcPr>
-            <w:tcW w:type="dxa" w:w="3135"/>
-          </w:tcPr>
-          <w:p>
-            <w:r>
-              <w:t>Catches mistakes before they happen by telling you the "type" of every piece of data (like text, number, etc.)</w:t>
-            </w:r>
-          </w:p>
-        </w:tc>
-      </w:tr>
-      <w:tr>
-        <w:tc>
-          <w:tcPr>
-            <w:tcW w:type="dxa" w:w="3135"/>
-            <w:shd w:fill="f5f5f5" w:val="clear"/>
-          </w:tcPr>
-          <w:p>
-            <w:r>
-              <w:t>Tailwind CSS 4</w:t>
-            </w:r>
-          </w:p>
-        </w:tc>
-        <w:tc>
-          <w:tcPr>
-            <w:tcW w:type="dxa" w:w="3135"/>
-            <w:shd w:fill="f5f5f5" w:val="clear"/>
-          </w:tcPr>
-          <w:p>
-            <w:r>
-              <w:t>A utility-first CSS framework</w:t>
-            </w:r>
-          </w:p>
-        </w:tc>
-        <w:tc>
-          <w:tcPr>
-            <w:tcW w:type="dxa" w:w="3135"/>
-            <w:shd w:fill="f5f5f5" w:val="clear"/>
-          </w:tcPr>
-          <w:p>
-            <w:r>
-              <w:t>Makes it super fast to style things — instead of writing long CSS files, you just add short class names to HTML elements</w:t>
-            </w:r>
-          </w:p>
-        </w:tc>
-      </w:tr>
-      <w:tr>
-        <w:tc>
-          <w:tcPr>
-            <w:tcW w:type="dxa" w:w="3135"/>
-          </w:tcPr>
-          <w:p>
-            <w:r>
-              <w:t>Zustand</w:t>
-            </w:r>
-          </w:p>
-        </w:tc>
-        <w:tc>
-          <w:tcPr>
-            <w:tcW w:type="dxa" w:w="3135"/>
-          </w:tcPr>
-          <w:p>
-            <w:r>
-              <w:t>A state management library</w:t>
-            </w:r>
-          </w:p>
-        </w:tc>
-        <w:tc>
-          <w:tcPr>
-            <w:tcW w:type="dxa" w:w="3135"/>
-          </w:tcPr>
-          <w:p>
-            <w:r>
-              <w:t>Keeps track of things like "what's in the shopping bag?" and "is the user logged in?" across the whole website</w:t>
-            </w:r>
-          </w:p>
-        </w:tc>
-      </w:tr>
-      <w:tr>
-        <w:tc>
-          <w:tcPr>
-            <w:tcW w:type="dxa" w:w="3135"/>
-            <w:shd w:fill="f5f5f5" w:val="clear"/>
-          </w:tcPr>
-          <w:p>
-            <w:r>
-              <w:t>React Query</w:t>
-            </w:r>
-          </w:p>
-        </w:tc>
-        <w:tc>
-          <w:tcPr>
-            <w:tcW w:type="dxa" w:w="3135"/>
-            <w:shd w:fill="f5f5f5" w:val="clear"/>
-          </w:tcPr>
-          <w:p>
-            <w:r>
-              <w:t>A data-fetching library</w:t>
-            </w:r>
-          </w:p>
-        </w:tc>
-        <w:tc>
-          <w:tcPr>
-            <w:tcW w:type="dxa" w:w="3135"/>
-            <w:shd w:fill="f5f5f5" w:val="clear"/>
-          </w:tcPr>
-          <w:p>
-            <w:r>
-              <w:t>Helps the website fetch data from the API efficiently and keeps it fresh without the user having to refresh</w:t>
-            </w:r>
-          </w:p>
-        </w:tc>
-      </w:tr>
-      <w:tr>
-        <w:tc>
-          <w:tcPr>
-            <w:tcW w:type="dxa" w:w="3135"/>
-          </w:tcPr>
-          <w:p>
-            <w:r>
-              <w:t>Framer Motion</w:t>
-            </w:r>
-          </w:p>
-        </w:tc>
-        <w:tc>
-          <w:tcPr>
-            <w:tcW w:type="dxa" w:w="3135"/>
-          </w:tcPr>
-          <w:p>
-            <w:r>
-              <w:t>An animation library</w:t>
-            </w:r>
-          </w:p>
-        </w:tc>
-        <w:tc>
-          <w:tcPr>
-            <w:tcW w:type="dxa" w:w="3135"/>
-          </w:tcPr>
-          <w:p>
-            <w:r>
-              <w:t>Makes things slide, fade, and bounce smoothly — like when a modal pops up or a menu opens</w:t>
-            </w:r>
-          </w:p>
-        </w:tc>
-      </w:tr>
-      <w:tr>
-        <w:tc>
-          <w:tcPr>
-            <w:tcW w:type="dxa" w:w="3135"/>
-            <w:shd w:fill="f5f5f5" w:val="clear"/>
-          </w:tcPr>
-          <w:p>
-            <w:r>
-              <w:t>Zod</w:t>
-            </w:r>
-          </w:p>
-        </w:tc>
-        <w:tc>
-          <w:tcPr>
-            <w:tcW w:type="dxa" w:w="3135"/>
-            <w:shd w:fill="f5f5f5" w:val="clear"/>
-          </w:tcPr>
-          <w:p>
-            <w:r>
-              <w:t>A form validation library</w:t>
-            </w:r>
-          </w:p>
-        </w:tc>
-        <w:tc>
-          <w:tcPr>
-            <w:tcW w:type="dxa" w:w="3135"/>
-            <w:shd w:fill="f5f5f5" w:val="clear"/>
-          </w:tcPr>
-          <w:p>
-            <w:r>
-              <w:t>Makes sure the user types valid information (like a real email address or a 16-digit card number) before submitting forms</w:t>
-            </w:r>
-          </w:p>
-        </w:tc>
-      </w:tr>
-      <w:tr>
-        <w:tc>
-          <w:tcPr>
-            <w:tcW w:type="dxa" w:w="3135"/>
-          </w:tcPr>
-          <w:p>
-            <w:r>
-              <w:t>React Hook Form</w:t>
-            </w:r>
-          </w:p>
-        </w:tc>
-        <w:tc>
-          <w:tcPr>
-            <w:tcW w:type="dxa" w:w="3135"/>
-          </w:tcPr>
-          <w:p>
-            <w:r>
-              <w:t>A form management library</w:t>
-            </w:r>
-          </w:p>
-        </w:tc>
-        <w:tc>
-          <w:tcPr>
-            <w:tcW w:type="dxa" w:w="3135"/>
-          </w:tcPr>
-          <w:p>
-            <w:r>
-              <w:t>Makes building forms easy and fast — handles user input, validation errors, and form submission</w:t>
-            </w:r>
-          </w:p>
-        </w:tc>
-      </w:tr>
-      <w:tr>
-        <w:tc>
-          <w:tcPr>
-            <w:tcW w:type="dxa" w:w="3135"/>
-            <w:shd w:fill="f5f5f5" w:val="clear"/>
-          </w:tcPr>
-          <w:p>
-            <w:r>
-              <w:t>Lucide React</w:t>
-            </w:r>
-          </w:p>
-        </w:tc>
-        <w:tc>
-          <w:tcPr>
-            <w:tcW w:type="dxa" w:w="3135"/>
-            <w:shd w:fill="f5f5f5" w:val="clear"/>
-          </w:tcPr>
-          <w:p>
-            <w:r>
-              <w:t>An icon library</w:t>
-            </w:r>
-          </w:p>
-        </w:tc>
-        <w:tc>
-          <w:tcPr>
-            <w:tcW w:type="dxa" w:w="3135"/>
-            <w:shd w:fill="f5f5f5" w:val="clear"/>
-          </w:tcPr>
-          <w:p>
-            <w:r>
-              <w:t>Provides beautiful, simple icons (like shopping bags, hearts, stars) used all over the website</w:t>
-            </w:r>
-          </w:p>
-        </w:tc>
-      </w:tr>
-    </w:tbl>
-    <w:p/>
-    <w:p>
-      <w:pPr>
-        <w:pStyle w:val="Heading2"/>
-      </w:pPr>
-      <w:r>
-        <w:t>Other Tools &amp; Libraries</w:t>
+        <w:t>2. Tech Stack</w:t>
       </w:r>
     </w:p>
     <w:p>
@@ -936,12 +65,9 @@
       </w:pPr>
       <w:r>
         <w:rPr>
-          <w:b/>
+          <w:sz w:val="19"/>
         </w:rPr>
-        <w:t xml:space="preserve">clsx + tailwind-merge: </w:t>
-      </w:r>
-      <w:r>
-        <w:t>Combines CSS class names smartly so there are no conflicts</w:t>
+        <w:t>Framework: Next.js 16 with App Router + TypeScript</w:t>
       </w:r>
     </w:p>
     <w:p>
@@ -950,12 +76,9 @@
       </w:pPr>
       <w:r>
         <w:rPr>
-          <w:b/>
+          <w:sz w:val="19"/>
         </w:rPr>
-        <w:t xml:space="preserve">class-variance-authority (CVA): </w:t>
-      </w:r>
-      <w:r>
-        <w:t>Helps create components (like buttons) that come in different styles (primary, outline, ghost)</w:t>
+        <w:t>Styling: Tailwind CSS v4 with HSL design tokens (globals.css)</w:t>
       </w:r>
     </w:p>
     <w:p>
@@ -964,12 +87,9 @@
       </w:pPr>
       <w:r>
         <w:rPr>
-          <w:b/>
+          <w:sz w:val="19"/>
         </w:rPr>
-        <w:t xml:space="preserve">next-themes: </w:t>
-      </w:r>
-      <w:r>
-        <w:t>Allows the website to switch between light mode and dark mode</w:t>
+        <w:t>State: Zustand — cart, wishlist, auth, toast, recently viewed</w:t>
       </w:r>
     </w:p>
     <w:p>
@@ -978,12 +98,9 @@
       </w:pPr>
       <w:r>
         <w:rPr>
-          <w:b/>
+          <w:sz w:val="19"/>
         </w:rPr>
-        <w:t xml:space="preserve">@hookform/resolvers: </w:t>
-      </w:r>
-      <w:r>
-        <w:t>Connects Zod validation to React Hook Form</w:t>
+        <w:t>Server State: TanStack Query — data fetching with caching</w:t>
       </w:r>
     </w:p>
     <w:p>
@@ -992,1395 +109,9 @@
       </w:pPr>
       <w:r>
         <w:rPr>
-          <w:b/>
+          <w:sz w:val="19"/>
         </w:rPr>
-        <w:t xml:space="preserve">@tanstack/react-query: </w:t>
-      </w:r>
-      <w:r>
-        <w:t>Manages server state and caching</w:t>
-      </w:r>
-    </w:p>
-    <w:p>
-      <w:r>
-        <w:br w:type="page"/>
-      </w:r>
-    </w:p>
-    <w:p>
-      <w:pPr>
-        <w:pStyle w:val="Heading1"/>
-      </w:pPr>
-      <w:r>
-        <w:t>3. How the Website Is Organized (File Structure)</w:t>
-      </w:r>
-    </w:p>
-    <w:p>
-      <w:pPr>
-        <w:pBdr>
-          <w:bottom w:val="single" w:sz="6" w:space="1" w:color="999999"/>
-        </w:pBdr>
-      </w:pPr>
-    </w:p>
-    <w:p>
-      <w:r>
-        <w:t>Just like a house has rooms for different purposes (kitchen for cooking, bedroom for sleeping), this website has folders for different purposes. Here is how everything is organized:</w:t>
-      </w:r>
-    </w:p>
-    <w:tbl>
-      <w:tblPr>
-        <w:tblStyle w:val="TableGrid"/>
-        <w:tblW w:type="auto" w:w="0"/>
-        <w:jc w:val="center"/>
-        <w:tblLook w:firstColumn="1" w:firstRow="1" w:lastColumn="0" w:lastRow="0" w:noHBand="0" w:noVBand="1" w:val="04A0"/>
-      </w:tblPr>
-      <w:tblGrid>
-        <w:gridCol w:w="4703"/>
-        <w:gridCol w:w="4703"/>
-      </w:tblGrid>
-      <w:tr>
-        <w:tc>
-          <w:tcPr>
-            <w:tcW w:type="dxa" w:w="4703"/>
-            <w:shd w:fill="1a1a2e" w:val="clear"/>
-          </w:tcPr>
-          <w:p>
-            <w:r>
-              <w:rPr>
-                <w:b/>
-                <w:color w:val="FFFFFF"/>
-              </w:rPr>
-              <w:t>Folder / File</w:t>
-            </w:r>
-          </w:p>
-        </w:tc>
-        <w:tc>
-          <w:tcPr>
-            <w:tcW w:type="dxa" w:w="4703"/>
-            <w:shd w:fill="1a1a2e" w:val="clear"/>
-          </w:tcPr>
-          <w:p>
-            <w:r>
-              <w:rPr>
-                <w:b/>
-                <w:color w:val="FFFFFF"/>
-              </w:rPr>
-              <w:t>What It Does</w:t>
-            </w:r>
-          </w:p>
-        </w:tc>
-      </w:tr>
-      <w:tr>
-        <w:tc>
-          <w:tcPr>
-            <w:tcW w:type="dxa" w:w="4703"/>
-          </w:tcPr>
-          <w:p>
-            <w:r>
-              <w:rPr>
-                <w:b/>
-              </w:rPr>
-              <w:t>app/</w:t>
-            </w:r>
-          </w:p>
-        </w:tc>
-        <w:tc>
-          <w:tcPr>
-            <w:tcW w:type="dxa" w:w="4703"/>
-          </w:tcPr>
-          <w:p>
-            <w:r>
-              <w:t>The brain of the website — contains all the pages and routes. Next.js reads this folder to know what pages to show when a user visits a URL.</w:t>
-            </w:r>
-          </w:p>
-        </w:tc>
-      </w:tr>
-      <w:tr>
-        <w:tc>
-          <w:tcPr>
-            <w:tcW w:type="dxa" w:w="4703"/>
-            <w:shd w:fill="f5f5f5" w:val="clear"/>
-          </w:tcPr>
-          <w:p>
-            <w:r>
-              <w:rPr>
-                <w:b/>
-              </w:rPr>
-              <w:t>app/(shop)/</w:t>
-            </w:r>
-          </w:p>
-        </w:tc>
-        <w:tc>
-          <w:tcPr>
-            <w:tcW w:type="dxa" w:w="4703"/>
-            <w:shd w:fill="f5f5f5" w:val="clear"/>
-          </w:tcPr>
-          <w:p>
-            <w:r>
-              <w:t>All the customer-facing pages (homepage, products, cart, checkout, etc.). The parentheses mean this is a "route group" — it organizes pages without adding an extra URL segment.</w:t>
-            </w:r>
-          </w:p>
-        </w:tc>
-      </w:tr>
-      <w:tr>
-        <w:tc>
-          <w:tcPr>
-            <w:tcW w:type="dxa" w:w="4703"/>
-          </w:tcPr>
-          <w:p>
-            <w:r>
-              <w:rPr>
-                <w:b/>
-              </w:rPr>
-              <w:t>app/admin/</w:t>
-            </w:r>
-          </w:p>
-        </w:tc>
-        <w:tc>
-          <w:tcPr>
-            <w:tcW w:type="dxa" w:w="4703"/>
-          </w:tcPr>
-          <w:p>
-            <w:r>
-              <w:t>The admin dashboard page for store owners to see analytics.</w:t>
-            </w:r>
-          </w:p>
-        </w:tc>
-      </w:tr>
-      <w:tr>
-        <w:tc>
-          <w:tcPr>
-            <w:tcW w:type="dxa" w:w="4703"/>
-            <w:shd w:fill="f5f5f5" w:val="clear"/>
-          </w:tcPr>
-          <w:p>
-            <w:r>
-              <w:rPr>
-                <w:b/>
-              </w:rPr>
-              <w:t>app/api/</w:t>
-            </w:r>
-          </w:p>
-        </w:tc>
-        <w:tc>
-          <w:tcPr>
-            <w:tcW w:type="dxa" w:w="4703"/>
-            <w:shd w:fill="f5f5f5" w:val="clear"/>
-          </w:tcPr>
-          <w:p>
-            <w:r>
-              <w:t>Server-side API routes that handle backend logic like processing checkouts.</w:t>
-            </w:r>
-          </w:p>
-        </w:tc>
-      </w:tr>
-      <w:tr>
-        <w:tc>
-          <w:tcPr>
-            <w:tcW w:type="dxa" w:w="4703"/>
-          </w:tcPr>
-          <w:p>
-            <w:r>
-              <w:rPr>
-                <w:b/>
-              </w:rPr>
-              <w:t>components/</w:t>
-            </w:r>
-          </w:p>
-        </w:tc>
-        <w:tc>
-          <w:tcPr>
-            <w:tcW w:type="dxa" w:w="4703"/>
-          </w:tcPr>
-          <w:p>
-            <w:r>
-              <w:t>Reusable building blocks of the user interface, split into 4 sub-folders.</w:t>
-            </w:r>
-          </w:p>
-        </w:tc>
-      </w:tr>
-      <w:tr>
-        <w:tc>
-          <w:tcPr>
-            <w:tcW w:type="dxa" w:w="4703"/>
-            <w:shd w:fill="f5f5f5" w:val="clear"/>
-          </w:tcPr>
-          <w:p>
-            <w:r>
-              <w:rPr>
-                <w:b/>
-              </w:rPr>
-              <w:t>components/ui/</w:t>
-            </w:r>
-          </w:p>
-        </w:tc>
-        <w:tc>
-          <w:tcPr>
-            <w:tcW w:type="dxa" w:w="4703"/>
-            <w:shd w:fill="f5f5f5" w:val="clear"/>
-          </w:tcPr>
-          <w:p>
-            <w:r>
-              <w:t>Basic UI elements: Button, Input, Select, Modal, Drawer, Skeleton, Toast.</w:t>
-            </w:r>
-          </w:p>
-        </w:tc>
-      </w:tr>
-      <w:tr>
-        <w:tc>
-          <w:tcPr>
-            <w:tcW w:type="dxa" w:w="4703"/>
-          </w:tcPr>
-          <w:p>
-            <w:r>
-              <w:rPr>
-                <w:b/>
-              </w:rPr>
-              <w:t>components/layout/</w:t>
-            </w:r>
-          </w:p>
-        </w:tc>
-        <w:tc>
-          <w:tcPr>
-            <w:tcW w:type="dxa" w:w="4703"/>
-          </w:tcPr>
-          <w:p>
-            <w:r>
-              <w:t>Structural components: Navbar (top navigation) and Footer (bottom section).</w:t>
-            </w:r>
-          </w:p>
-        </w:tc>
-      </w:tr>
-      <w:tr>
-        <w:tc>
-          <w:tcPr>
-            <w:tcW w:type="dxa" w:w="4703"/>
-            <w:shd w:fill="f5f5f5" w:val="clear"/>
-          </w:tcPr>
-          <w:p>
-            <w:r>
-              <w:rPr>
-                <w:b/>
-              </w:rPr>
-              <w:t>components/product/</w:t>
-            </w:r>
-          </w:p>
-        </w:tc>
-        <w:tc>
-          <w:tcPr>
-            <w:tcW w:type="dxa" w:w="4703"/>
-            <w:shd w:fill="f5f5f5" w:val="clear"/>
-          </w:tcPr>
-          <w:p>
-            <w:r>
-              <w:t>Product-related components: ProductCard, ProductGallery, Filters, Rating, etc.</w:t>
-            </w:r>
-          </w:p>
-        </w:tc>
-      </w:tr>
-      <w:tr>
-        <w:tc>
-          <w:tcPr>
-            <w:tcW w:type="dxa" w:w="4703"/>
-          </w:tcPr>
-          <w:p>
-            <w:r>
-              <w:rPr>
-                <w:b/>
-              </w:rPr>
-              <w:t>components/common/</w:t>
-            </w:r>
-          </w:p>
-        </w:tc>
-        <w:tc>
-          <w:tcPr>
-            <w:tcW w:type="dxa" w:w="4703"/>
-          </w:tcPr>
-          <w:p>
-            <w:r>
-              <w:t>Shared features: Breadcrumb, FAQ, Newsletter, Testimonials, FlashSale, etc.</w:t>
-            </w:r>
-          </w:p>
-        </w:tc>
-      </w:tr>
-      <w:tr>
-        <w:tc>
-          <w:tcPr>
-            <w:tcW w:type="dxa" w:w="4703"/>
-            <w:shd w:fill="f5f5f5" w:val="clear"/>
-          </w:tcPr>
-          <w:p>
-            <w:r>
-              <w:rPr>
-                <w:b/>
-              </w:rPr>
-              <w:t>store/</w:t>
-            </w:r>
-          </w:p>
-        </w:tc>
-        <w:tc>
-          <w:tcPr>
-            <w:tcW w:type="dxa" w:w="4703"/>
-            <w:shd w:fill="f5f5f5" w:val="clear"/>
-          </w:tcPr>
-          <w:p>
-            <w:r>
-              <w:t>State management stores — the "memory" of the website (cart, auth, wishlist, etc.).</w:t>
-            </w:r>
-          </w:p>
-        </w:tc>
-      </w:tr>
-      <w:tr>
-        <w:tc>
-          <w:tcPr>
-            <w:tcW w:type="dxa" w:w="4703"/>
-          </w:tcPr>
-          <w:p>
-            <w:r>
-              <w:rPr>
-                <w:b/>
-              </w:rPr>
-              <w:t>services/</w:t>
-            </w:r>
-          </w:p>
-        </w:tc>
-        <w:tc>
-          <w:tcPr>
-            <w:tcW w:type="dxa" w:w="4703"/>
-          </w:tcPr>
-          <w:p>
-            <w:r>
-              <w:t>API service layer — functions that talk to the backend to fetch or send data.</w:t>
-            </w:r>
-          </w:p>
-        </w:tc>
-      </w:tr>
-      <w:tr>
-        <w:tc>
-          <w:tcPr>
-            <w:tcW w:type="dxa" w:w="4703"/>
-            <w:shd w:fill="f5f5f5" w:val="clear"/>
-          </w:tcPr>
-          <w:p>
-            <w:r>
-              <w:rPr>
-                <w:b/>
-              </w:rPr>
-              <w:t>mock/</w:t>
-            </w:r>
-          </w:p>
-        </w:tc>
-        <w:tc>
-          <w:tcPr>
-            <w:tcW w:type="dxa" w:w="4703"/>
-            <w:shd w:fill="f5f5f5" w:val="clear"/>
-          </w:tcPr>
-          <w:p>
-            <w:r>
-              <w:t>Fake data used for development — products, categories, brands, reviews, etc.</w:t>
-            </w:r>
-          </w:p>
-        </w:tc>
-      </w:tr>
-      <w:tr>
-        <w:tc>
-          <w:tcPr>
-            <w:tcW w:type="dxa" w:w="4703"/>
-          </w:tcPr>
-          <w:p>
-            <w:r>
-              <w:rPr>
-                <w:b/>
-              </w:rPr>
-              <w:t>types/</w:t>
-            </w:r>
-          </w:p>
-        </w:tc>
-        <w:tc>
-          <w:tcPr>
-            <w:tcW w:type="dxa" w:w="4703"/>
-          </w:tcPr>
-          <w:p>
-            <w:r>
-              <w:t>TypeScript type definitions — the "blueprints" for all data structures.</w:t>
-            </w:r>
-          </w:p>
-        </w:tc>
-      </w:tr>
-      <w:tr>
-        <w:tc>
-          <w:tcPr>
-            <w:tcW w:type="dxa" w:w="4703"/>
-            <w:shd w:fill="f5f5f5" w:val="clear"/>
-          </w:tcPr>
-          <w:p>
-            <w:r>
-              <w:rPr>
-                <w:b/>
-              </w:rPr>
-              <w:t>lib/</w:t>
-            </w:r>
-          </w:p>
-        </w:tc>
-        <w:tc>
-          <w:tcPr>
-            <w:tcW w:type="dxa" w:w="4703"/>
-            <w:shd w:fill="f5f5f5" w:val="clear"/>
-          </w:tcPr>
-          <w:p>
-            <w:r>
-              <w:t>Utility/helper functions (formatting prices, merging CSS classes).</w:t>
-            </w:r>
-          </w:p>
-        </w:tc>
-      </w:tr>
-      <w:tr>
-        <w:tc>
-          <w:tcPr>
-            <w:tcW w:type="dxa" w:w="4703"/>
-          </w:tcPr>
-          <w:p>
-            <w:r>
-              <w:rPr>
-                <w:b/>
-              </w:rPr>
-              <w:t>styles/</w:t>
-            </w:r>
-          </w:p>
-        </w:tc>
-        <w:tc>
-          <w:tcPr>
-            <w:tcW w:type="dxa" w:w="4703"/>
-          </w:tcPr>
-          <w:p>
-            <w:r>
-              <w:t>Global CSS styles and Tailwind configuration.</w:t>
-            </w:r>
-          </w:p>
-        </w:tc>
-      </w:tr>
-      <w:tr>
-        <w:tc>
-          <w:tcPr>
-            <w:tcW w:type="dxa" w:w="4703"/>
-            <w:shd w:fill="f5f5f5" w:val="clear"/>
-          </w:tcPr>
-          <w:p>
-            <w:r>
-              <w:rPr>
-                <w:b/>
-              </w:rPr>
-              <w:t>.agents/skills/</w:t>
-            </w:r>
-          </w:p>
-        </w:tc>
-        <w:tc>
-          <w:tcPr>
-            <w:tcW w:type="dxa" w:w="4703"/>
-            <w:shd w:fill="f5f5f5" w:val="clear"/>
-          </w:tcPr>
-          <w:p>
-            <w:r>
-              <w:t>AI agent skills for design, UI styling, and code generation.</w:t>
-            </w:r>
-          </w:p>
-        </w:tc>
-      </w:tr>
-    </w:tbl>
-    <w:p>
-      <w:r>
-        <w:br w:type="page"/>
-      </w:r>
-    </w:p>
-    <w:p>
-      <w:pPr>
-        <w:pStyle w:val="Heading1"/>
-      </w:pPr>
-      <w:r>
-        <w:t>4. The Pages: Where Users Go</w:t>
-      </w:r>
-    </w:p>
-    <w:p>
-      <w:pPr>
-        <w:pBdr>
-          <w:bottom w:val="single" w:sz="6" w:space="1" w:color="999999"/>
-        </w:pBdr>
-      </w:pPr>
-    </w:p>
-    <w:p>
-      <w:r>
-        <w:t>Every time you type a web address (URL) in your browser, Next.js looks at the "app/" folder and finds the matching page to show you. Here are all the pages in FISTO:</w:t>
-      </w:r>
-    </w:p>
-    <w:p>
-      <w:pPr>
-        <w:pStyle w:val="Heading2"/>
-      </w:pPr>
-      <w:r>
-        <w:t>Customer-Facing Pages (the Shop)</w:t>
-      </w:r>
-    </w:p>
-    <w:tbl>
-      <w:tblPr>
-        <w:tblStyle w:val="TableGrid"/>
-        <w:tblW w:type="auto" w:w="0"/>
-        <w:jc w:val="center"/>
-        <w:tblLook w:firstColumn="1" w:firstRow="1" w:lastColumn="0" w:lastRow="0" w:noHBand="0" w:noVBand="1" w:val="04A0"/>
-      </w:tblPr>
-      <w:tblGrid>
-        <w:gridCol w:w="3135"/>
-        <w:gridCol w:w="3135"/>
-        <w:gridCol w:w="3135"/>
-      </w:tblGrid>
-      <w:tr>
-        <w:tc>
-          <w:tcPr>
-            <w:tcW w:type="dxa" w:w="3135"/>
-            <w:shd w:fill="1a1a2e" w:val="clear"/>
-          </w:tcPr>
-          <w:p>
-            <w:r>
-              <w:rPr>
-                <w:b/>
-                <w:color w:val="FFFFFF"/>
-              </w:rPr>
-              <w:t>URL Route</w:t>
-            </w:r>
-          </w:p>
-        </w:tc>
-        <w:tc>
-          <w:tcPr>
-            <w:tcW w:type="dxa" w:w="3135"/>
-            <w:shd w:fill="1a1a2e" w:val="clear"/>
-          </w:tcPr>
-          <w:p>
-            <w:r>
-              <w:rPr>
-                <w:b/>
-                <w:color w:val="FFFFFF"/>
-              </w:rPr>
-              <w:t>File</w:t>
-            </w:r>
-          </w:p>
-        </w:tc>
-        <w:tc>
-          <w:tcPr>
-            <w:tcW w:type="dxa" w:w="3135"/>
-            <w:shd w:fill="1a1a2e" w:val="clear"/>
-          </w:tcPr>
-          <w:p>
-            <w:r>
-              <w:rPr>
-                <w:b/>
-                <w:color w:val="FFFFFF"/>
-              </w:rPr>
-              <w:t>What It Does</w:t>
-            </w:r>
-          </w:p>
-        </w:tc>
-      </w:tr>
-      <w:tr>
-        <w:tc>
-          <w:tcPr>
-            <w:tcW w:type="dxa" w:w="3135"/>
-          </w:tcPr>
-          <w:p>
-            <w:r>
-              <w:t>/ (Homepage)</w:t>
-            </w:r>
-          </w:p>
-        </w:tc>
-        <w:tc>
-          <w:tcPr>
-            <w:tcW w:type="dxa" w:w="3135"/>
-          </w:tcPr>
-          <w:p>
-            <w:r>
-              <w:t>page.tsx</w:t>
-            </w:r>
-          </w:p>
-        </w:tc>
-        <w:tc>
-          <w:tcPr>
-            <w:tcW w:type="dxa" w:w="3135"/>
-          </w:tcPr>
-          <w:p>
-            <w:r>
-              <w:t>The front door of the store. Shows a hero banner, featured categories, product carousels, flash sale countdown, best sellers, testimonials, FAQ, and a newsletter signup. This is the richest page with 11 distinct sections.</w:t>
-            </w:r>
-          </w:p>
-        </w:tc>
-      </w:tr>
-      <w:tr>
-        <w:tc>
-          <w:tcPr>
-            <w:tcW w:type="dxa" w:w="3135"/>
-            <w:shd w:fill="f5f5f5" w:val="clear"/>
-          </w:tcPr>
-          <w:p>
-            <w:r>
-              <w:t>/products</w:t>
-            </w:r>
-          </w:p>
-        </w:tc>
-        <w:tc>
-          <w:tcPr>
-            <w:tcW w:type="dxa" w:w="3135"/>
-            <w:shd w:fill="f5f5f5" w:val="clear"/>
-          </w:tcPr>
-          <w:p>
-            <w:r>
-              <w:t>page.tsx</w:t>
-            </w:r>
-          </w:p>
-        </w:tc>
-        <w:tc>
-          <w:tcPr>
-            <w:tcW w:type="dxa" w:w="3135"/>
-            <w:shd w:fill="f5f5f5" w:val="clear"/>
-          </w:tcPr>
-          <w:p>
-            <w:r>
-              <w:t>Shows all available products in a filterable grid. Users can filter by category, brand, price range, and rating. Also supports sorting and URL-based search.</w:t>
-            </w:r>
-          </w:p>
-        </w:tc>
-      </w:tr>
-      <w:tr>
-        <w:tc>
-          <w:tcPr>
-            <w:tcW w:type="dxa" w:w="3135"/>
-          </w:tcPr>
-          <w:p>
-            <w:r>
-              <w:t>/products/[slug]</w:t>
-            </w:r>
-          </w:p>
-        </w:tc>
-        <w:tc>
-          <w:tcPr>
-            <w:tcW w:type="dxa" w:w="3135"/>
-          </w:tcPr>
-          <w:p>
-            <w:r>
-              <w:t>page.tsx</w:t>
-            </w:r>
-          </w:p>
-        </w:tc>
-        <w:tc>
-          <w:tcPr>
-            <w:tcW w:type="dxa" w:w="3135"/>
-          </w:tcPr>
-          <w:p>
-            <w:r>
-              <w:t>A detailed view of a single product. Shows images with zoom, variant selectors (color/size), quantity picker, add-to-cart, wishlist, specifications tab, reviews, and related products.</w:t>
-            </w:r>
-          </w:p>
-        </w:tc>
-      </w:tr>
-      <w:tr>
-        <w:tc>
-          <w:tcPr>
-            <w:tcW w:type="dxa" w:w="3135"/>
-            <w:shd w:fill="f5f5f5" w:val="clear"/>
-          </w:tcPr>
-          <w:p>
-            <w:r>
-              <w:t>/categories/[slug]</w:t>
-            </w:r>
-          </w:p>
-        </w:tc>
-        <w:tc>
-          <w:tcPr>
-            <w:tcW w:type="dxa" w:w="3135"/>
-            <w:shd w:fill="f5f5f5" w:val="clear"/>
-          </w:tcPr>
-          <w:p>
-            <w:r>
-              <w:t>page.tsx</w:t>
-            </w:r>
-          </w:p>
-        </w:tc>
-        <w:tc>
-          <w:tcPr>
-            <w:tcW w:type="dxa" w:w="3135"/>
-            <w:shd w:fill="f5f5f5" w:val="clear"/>
-          </w:tcPr>
-          <w:p>
-            <w:r>
-              <w:t>Shows products filtered to a specific category (like "Audio &amp; Sound" or "Wearables").</w:t>
-            </w:r>
-          </w:p>
-        </w:tc>
-      </w:tr>
-      <w:tr>
-        <w:tc>
-          <w:tcPr>
-            <w:tcW w:type="dxa" w:w="3135"/>
-          </w:tcPr>
-          <w:p>
-            <w:r>
-              <w:t>/search</w:t>
-            </w:r>
-          </w:p>
-        </w:tc>
-        <w:tc>
-          <w:tcPr>
-            <w:tcW w:type="dxa" w:w="3135"/>
-          </w:tcPr>
-          <w:p>
-            <w:r>
-              <w:t>page.tsx</w:t>
-            </w:r>
-          </w:p>
-        </w:tc>
-        <w:tc>
-          <w:tcPr>
-            <w:tcW w:type="dxa" w:w="3135"/>
-          </w:tcPr>
-          <w:p>
-            <w:r>
-              <w:t>Search results page — shows products matching a search query.</w:t>
-            </w:r>
-          </w:p>
-        </w:tc>
-      </w:tr>
-      <w:tr>
-        <w:tc>
-          <w:tcPr>
-            <w:tcW w:type="dxa" w:w="3135"/>
-            <w:shd w:fill="f5f5f5" w:val="clear"/>
-          </w:tcPr>
-          <w:p>
-            <w:r>
-              <w:t>/cart</w:t>
-            </w:r>
-          </w:p>
-        </w:tc>
-        <w:tc>
-          <w:tcPr>
-            <w:tcW w:type="dxa" w:w="3135"/>
-            <w:shd w:fill="f5f5f5" w:val="clear"/>
-          </w:tcPr>
-          <w:p>
-            <w:r>
-              <w:t>page.tsx</w:t>
-            </w:r>
-          </w:p>
-        </w:tc>
-        <w:tc>
-          <w:tcPr>
-            <w:tcW w:type="dxa" w:w="3135"/>
-            <w:shd w:fill="f5f5f5" w:val="clear"/>
-          </w:tcPr>
-          <w:p>
-            <w:r>
-              <w:t>The shopping bag page. Shows all items, lets you change quantities, apply discount codes, and see the total cost with tax.</w:t>
-            </w:r>
-          </w:p>
-        </w:tc>
-      </w:tr>
-      <w:tr>
-        <w:tc>
-          <w:tcPr>
-            <w:tcW w:type="dxa" w:w="3135"/>
-          </w:tcPr>
-          <w:p>
-            <w:r>
-              <w:t>/checkout</w:t>
-            </w:r>
-          </w:p>
-        </w:tc>
-        <w:tc>
-          <w:tcPr>
-            <w:tcW w:type="dxa" w:w="3135"/>
-          </w:tcPr>
-          <w:p>
-            <w:r>
-              <w:t>page.tsx</w:t>
-            </w:r>
-          </w:p>
-        </w:tc>
-        <w:tc>
-          <w:tcPr>
-            <w:tcW w:type="dxa" w:w="3135"/>
-          </w:tcPr>
-          <w:p>
-            <w:r>
-              <w:t>A multi-step form for entering shipping details and payment info. Uses Zod for strict validation. Shows order summary on the side.</w:t>
-            </w:r>
-          </w:p>
-        </w:tc>
-      </w:tr>
-      <w:tr>
-        <w:tc>
-          <w:tcPr>
-            <w:tcW w:type="dxa" w:w="3135"/>
-            <w:shd w:fill="f5f5f5" w:val="clear"/>
-          </w:tcPr>
-          <w:p>
-            <w:r>
-              <w:t>/wishlist</w:t>
-            </w:r>
-          </w:p>
-        </w:tc>
-        <w:tc>
-          <w:tcPr>
-            <w:tcW w:type="dxa" w:w="3135"/>
-            <w:shd w:fill="f5f5f5" w:val="clear"/>
-          </w:tcPr>
-          <w:p>
-            <w:r>
-              <w:t>page.tsx</w:t>
-            </w:r>
-          </w:p>
-        </w:tc>
-        <w:tc>
-          <w:tcPr>
-            <w:tcW w:type="dxa" w:w="3135"/>
-            <w:shd w:fill="f5f5f5" w:val="clear"/>
-          </w:tcPr>
-          <w:p>
-            <w:r>
-              <w:t>Shows all products the user has saved for later.</w:t>
-            </w:r>
-          </w:p>
-        </w:tc>
-      </w:tr>
-      <w:tr>
-        <w:tc>
-          <w:tcPr>
-            <w:tcW w:type="dxa" w:w="3135"/>
-          </w:tcPr>
-          <w:p>
-            <w:r>
-              <w:t>/account</w:t>
-            </w:r>
-          </w:p>
-        </w:tc>
-        <w:tc>
-          <w:tcPr>
-            <w:tcW w:type="dxa" w:w="3135"/>
-          </w:tcPr>
-          <w:p>
-            <w:r>
-              <w:t>page.tsx</w:t>
-            </w:r>
-          </w:p>
-        </w:tc>
-        <w:tc>
-          <w:tcPr>
-            <w:tcW w:type="dxa" w:w="3135"/>
-          </w:tcPr>
-          <w:p>
-            <w:r>
-              <w:t>User account dashboard with profile info and order history.</w:t>
-            </w:r>
-          </w:p>
-        </w:tc>
-      </w:tr>
-      <w:tr>
-        <w:tc>
-          <w:tcPr>
-            <w:tcW w:type="dxa" w:w="3135"/>
-            <w:shd w:fill="f5f5f5" w:val="clear"/>
-          </w:tcPr>
-          <w:p>
-            <w:r>
-              <w:t>/account/orders</w:t>
-            </w:r>
-          </w:p>
-        </w:tc>
-        <w:tc>
-          <w:tcPr>
-            <w:tcW w:type="dxa" w:w="3135"/>
-            <w:shd w:fill="f5f5f5" w:val="clear"/>
-          </w:tcPr>
-          <w:p>
-            <w:r>
-              <w:t>page.tsx</w:t>
-            </w:r>
-          </w:p>
-        </w:tc>
-        <w:tc>
-          <w:tcPr>
-            <w:tcW w:type="dxa" w:w="3135"/>
-            <w:shd w:fill="f5f5f5" w:val="clear"/>
-          </w:tcPr>
-          <w:p>
-            <w:r>
-              <w:t>Lists all orders placed by the user.</w:t>
-            </w:r>
-          </w:p>
-        </w:tc>
-      </w:tr>
-      <w:tr>
-        <w:tc>
-          <w:tcPr>
-            <w:tcW w:type="dxa" w:w="3135"/>
-          </w:tcPr>
-          <w:p>
-            <w:r>
-              <w:t>/account/orders/[id]</w:t>
-            </w:r>
-          </w:p>
-        </w:tc>
-        <w:tc>
-          <w:tcPr>
-            <w:tcW w:type="dxa" w:w="3135"/>
-          </w:tcPr>
-          <w:p>
-            <w:r>
-              <w:t>page.tsx</w:t>
-            </w:r>
-          </w:p>
-        </w:tc>
-        <w:tc>
-          <w:tcPr>
-            <w:tcW w:type="dxa" w:w="3135"/>
-          </w:tcPr>
-          <w:p>
-            <w:r>
-              <w:t>Detailed view of a specific order with status and tracking.</w:t>
-            </w:r>
-          </w:p>
-        </w:tc>
-      </w:tr>
-      <w:tr>
-        <w:tc>
-          <w:tcPr>
-            <w:tcW w:type="dxa" w:w="3135"/>
-            <w:shd w:fill="f5f5f5" w:val="clear"/>
-          </w:tcPr>
-          <w:p>
-            <w:r>
-              <w:t>/login</w:t>
-            </w:r>
-          </w:p>
-        </w:tc>
-        <w:tc>
-          <w:tcPr>
-            <w:tcW w:type="dxa" w:w="3135"/>
-            <w:shd w:fill="f5f5f5" w:val="clear"/>
-          </w:tcPr>
-          <w:p>
-            <w:r>
-              <w:t>page.tsx</w:t>
-            </w:r>
-          </w:p>
-        </w:tc>
-        <w:tc>
-          <w:tcPr>
-            <w:tcW w:type="dxa" w:w="3135"/>
-            <w:shd w:fill="f5f5f5" w:val="clear"/>
-          </w:tcPr>
-          <w:p>
-            <w:r>
-              <w:t>Login form for existing users.</w:t>
-            </w:r>
-          </w:p>
-        </w:tc>
-      </w:tr>
-      <w:tr>
-        <w:tc>
-          <w:tcPr>
-            <w:tcW w:type="dxa" w:w="3135"/>
-          </w:tcPr>
-          <w:p>
-            <w:r>
-              <w:t>/register</w:t>
-            </w:r>
-          </w:p>
-        </w:tc>
-        <w:tc>
-          <w:tcPr>
-            <w:tcW w:type="dxa" w:w="3135"/>
-          </w:tcPr>
-          <w:p>
-            <w:r>
-              <w:t>page.tsx</w:t>
-            </w:r>
-          </w:p>
-        </w:tc>
-        <w:tc>
-          <w:tcPr>
-            <w:tcW w:type="dxa" w:w="3135"/>
-          </w:tcPr>
-          <w:p>
-            <w:r>
-              <w:t>Registration form for new users.</w:t>
-            </w:r>
-          </w:p>
-        </w:tc>
-      </w:tr>
-      <w:tr>
-        <w:tc>
-          <w:tcPr>
-            <w:tcW w:type="dxa" w:w="3135"/>
-            <w:shd w:fill="f5f5f5" w:val="clear"/>
-          </w:tcPr>
-          <w:p>
-            <w:r>
-              <w:t>/forgot-password</w:t>
-            </w:r>
-          </w:p>
-        </w:tc>
-        <w:tc>
-          <w:tcPr>
-            <w:tcW w:type="dxa" w:w="3135"/>
-            <w:shd w:fill="f5f5f5" w:val="clear"/>
-          </w:tcPr>
-          <w:p>
-            <w:r>
-              <w:t>page.tsx</w:t>
-            </w:r>
-          </w:p>
-        </w:tc>
-        <w:tc>
-          <w:tcPr>
-            <w:tcW w:type="dxa" w:w="3135"/>
-            <w:shd w:fill="f5f5f5" w:val="clear"/>
-          </w:tcPr>
-          <w:p>
-            <w:r>
-              <w:t>Password recovery form.</w:t>
-            </w:r>
-          </w:p>
-        </w:tc>
-      </w:tr>
-      <w:tr>
-        <w:tc>
-          <w:tcPr>
-            <w:tcW w:type="dxa" w:w="3135"/>
-          </w:tcPr>
-          <w:p>
-            <w:r>
-              <w:t>/about</w:t>
-            </w:r>
-          </w:p>
-        </w:tc>
-        <w:tc>
-          <w:tcPr>
-            <w:tcW w:type="dxa" w:w="3135"/>
-          </w:tcPr>
-          <w:p>
-            <w:r>
-              <w:t>page.tsx</w:t>
-            </w:r>
-          </w:p>
-        </w:tc>
-        <w:tc>
-          <w:tcPr>
-            <w:tcW w:type="dxa" w:w="3135"/>
-          </w:tcPr>
-          <w:p>
-            <w:r>
-              <w:t>About the FISTO brand — philosophy, sustainability, story.</w:t>
-            </w:r>
-          </w:p>
-        </w:tc>
-      </w:tr>
-      <w:tr>
-        <w:tc>
-          <w:tcPr>
-            <w:tcW w:type="dxa" w:w="3135"/>
-            <w:shd w:fill="f5f5f5" w:val="clear"/>
-          </w:tcPr>
-          <w:p>
-            <w:r>
-              <w:t>/contact</w:t>
-            </w:r>
-          </w:p>
-        </w:tc>
-        <w:tc>
-          <w:tcPr>
-            <w:tcW w:type="dxa" w:w="3135"/>
-            <w:shd w:fill="f5f5f5" w:val="clear"/>
-          </w:tcPr>
-          <w:p>
-            <w:r>
-              <w:t>page.tsx</w:t>
-            </w:r>
-          </w:p>
-        </w:tc>
-        <w:tc>
-          <w:tcPr>
-            <w:tcW w:type="dxa" w:w="3135"/>
-            <w:shd w:fill="f5f5f5" w:val="clear"/>
-          </w:tcPr>
-          <w:p>
-            <w:r>
-              <w:t>Contact form and information page.</w:t>
-            </w:r>
-          </w:p>
-        </w:tc>
-      </w:tr>
-      <w:tr>
-        <w:tc>
-          <w:tcPr>
-            <w:tcW w:type="dxa" w:w="3135"/>
-          </w:tcPr>
-          <w:p>
-            <w:r>
-              <w:t>/privacy</w:t>
-            </w:r>
-          </w:p>
-        </w:tc>
-        <w:tc>
-          <w:tcPr>
-            <w:tcW w:type="dxa" w:w="3135"/>
-          </w:tcPr>
-          <w:p>
-            <w:r>
-              <w:t>page.tsx</w:t>
-            </w:r>
-          </w:p>
-        </w:tc>
-        <w:tc>
-          <w:tcPr>
-            <w:tcW w:type="dxa" w:w="3135"/>
-          </w:tcPr>
-          <w:p>
-            <w:r>
-              <w:t>Privacy policy page.</w:t>
-            </w:r>
-          </w:p>
-        </w:tc>
-      </w:tr>
-      <w:tr>
-        <w:tc>
-          <w:tcPr>
-            <w:tcW w:type="dxa" w:w="3135"/>
-            <w:shd w:fill="f5f5f5" w:val="clear"/>
-          </w:tcPr>
-          <w:p>
-            <w:r>
-              <w:t>/terms</w:t>
-            </w:r>
-          </w:p>
-        </w:tc>
-        <w:tc>
-          <w:tcPr>
-            <w:tcW w:type="dxa" w:w="3135"/>
-            <w:shd w:fill="f5f5f5" w:val="clear"/>
-          </w:tcPr>
-          <w:p>
-            <w:r>
-              <w:t>page.tsx</w:t>
-            </w:r>
-          </w:p>
-        </w:tc>
-        <w:tc>
-          <w:tcPr>
-            <w:tcW w:type="dxa" w:w="3135"/>
-            <w:shd w:fill="f5f5f5" w:val="clear"/>
-          </w:tcPr>
-          <w:p>
-            <w:r>
-              <w:t>Terms of service page.</w:t>
-            </w:r>
-          </w:p>
-        </w:tc>
-      </w:tr>
-      <w:tr>
-        <w:tc>
-          <w:tcPr>
-            <w:tcW w:type="dxa" w:w="3135"/>
-          </w:tcPr>
-          <w:p>
-            <w:r>
-              <w:t>/admin</w:t>
-            </w:r>
-          </w:p>
-        </w:tc>
-        <w:tc>
-          <w:tcPr>
-            <w:tcW w:type="dxa" w:w="3135"/>
-          </w:tcPr>
-          <w:p>
-            <w:r>
-              <w:t>page.tsx</w:t>
-            </w:r>
-          </w:p>
-        </w:tc>
-        <w:tc>
-          <w:tcPr>
-            <w:tcW w:type="dxa" w:w="3135"/>
-          </w:tcPr>
-          <w:p>
-            <w:r>
-              <w:t>Admin dashboard with KPI cards, sales chart (SVG), and recent orders log.</w:t>
-            </w:r>
-          </w:p>
-        </w:tc>
-      </w:tr>
-    </w:tbl>
-    <w:p>
-      <w:pPr>
-        <w:pStyle w:val="Heading2"/>
-      </w:pPr>
-      <w:r>
-        <w:t>API Routes (Backend Endpoints)</w:t>
-      </w:r>
-    </w:p>
-    <w:tbl>
-      <w:tblPr>
-        <w:tblStyle w:val="TableGrid"/>
-        <w:tblW w:type="auto" w:w="0"/>
-        <w:jc w:val="center"/>
-        <w:tblLook w:firstColumn="1" w:firstRow="1" w:lastColumn="0" w:lastRow="0" w:noHBand="0" w:noVBand="1" w:val="04A0"/>
-      </w:tblPr>
-      <w:tblGrid>
-        <w:gridCol w:w="3135"/>
-        <w:gridCol w:w="3135"/>
-        <w:gridCol w:w="3135"/>
-      </w:tblGrid>
-      <w:tr>
-        <w:tc>
-          <w:tcPr>
-            <w:tcW w:type="dxa" w:w="3135"/>
-            <w:shd w:fill="1a1a2e" w:val="clear"/>
-          </w:tcPr>
-          <w:p>
-            <w:r>
-              <w:rPr>
-                <w:b/>
-                <w:color w:val="FFFFFF"/>
-              </w:rPr>
-              <w:t>API Endpoint</w:t>
-            </w:r>
-          </w:p>
-        </w:tc>
-        <w:tc>
-          <w:tcPr>
-            <w:tcW w:type="dxa" w:w="3135"/>
-            <w:shd w:fill="1a1a2e" w:val="clear"/>
-          </w:tcPr>
-          <w:p>
-            <w:r>
-              <w:rPr>
-                <w:b/>
-                <w:color w:val="FFFFFF"/>
-              </w:rPr>
-              <w:t>File</w:t>
-            </w:r>
-          </w:p>
-        </w:tc>
-        <w:tc>
-          <w:tcPr>
-            <w:tcW w:type="dxa" w:w="3135"/>
-            <w:shd w:fill="1a1a2e" w:val="clear"/>
-          </w:tcPr>
-          <w:p>
-            <w:r>
-              <w:rPr>
-                <w:b/>
-                <w:color w:val="FFFFFF"/>
-              </w:rPr>
-              <w:t>What It Does</w:t>
-            </w:r>
-          </w:p>
-        </w:tc>
-      </w:tr>
-      <w:tr>
-        <w:tc>
-          <w:tcPr>
-            <w:tcW w:type="dxa" w:w="3135"/>
-          </w:tcPr>
-          <w:p>
-            <w:r>
-              <w:t>POST /api/checkout</w:t>
-            </w:r>
-          </w:p>
-        </w:tc>
-        <w:tc>
-          <w:tcPr>
-            <w:tcW w:type="dxa" w:w="3135"/>
-          </w:tcPr>
-          <w:p>
-            <w:r>
-              <w:t>route.ts</w:t>
-            </w:r>
-          </w:p>
-        </w:tc>
-        <w:tc>
-          <w:tcPr>
-            <w:tcW w:type="dxa" w:w="3135"/>
-          </w:tcPr>
-          <w:p>
-            <w:r>
-              <w:t>Receives checkout data, validates the cart is not empty, generates an order ID, and returns a confirmation. This is where orders are processed.</w:t>
-            </w:r>
-          </w:p>
-        </w:tc>
-      </w:tr>
-      <w:tr>
-        <w:tc>
-          <w:tcPr>
-            <w:tcW w:type="dxa" w:w="3135"/>
-          </w:tcPr>
-          <w:p>
-            <w:r>
-              <w:t>GET /api/products</w:t>
-            </w:r>
-          </w:p>
-        </w:tc>
-        <w:tc>
-          <w:tcPr>
-            <w:tcW w:type="dxa" w:w="3135"/>
-          </w:tcPr>
-          <w:p>
-            <w:r>
-              <w:t>route.ts</w:t>
-            </w:r>
-          </w:p>
-        </w:tc>
-        <w:tc>
-          <w:tcPr>
-            <w:tcW w:type="dxa" w:w="3135"/>
-          </w:tcPr>
-          <w:p>
-            <w:r>
-              <w:t>Returns a list of products, optionally filtered by search query or category via URL parameters. Used for server-side data fetching.</w:t>
-            </w:r>
-          </w:p>
-        </w:tc>
-      </w:tr>
-    </w:tbl>
-    <w:p>
-      <w:r>
-        <w:br w:type="page"/>
-      </w:r>
-    </w:p>
-    <w:p>
-      <w:pPr>
-        <w:pStyle w:val="Heading1"/>
-      </w:pPr>
-      <w:r>
-        <w:t>5. The Building Blocks: Components</w:t>
-      </w:r>
-    </w:p>
-    <w:p>
-      <w:pPr>
-        <w:pBdr>
-          <w:bottom w:val="single" w:sz="6" w:space="1" w:color="999999"/>
-        </w:pBdr>
-      </w:pPr>
-    </w:p>
-    <w:p>
-      <w:r>
-        <w:t>Think of components like LEGO blocks. Each block does one specific thing, and you snap them together to build the whole website. FISTO has 25+ components organized into 4 groups:</w:t>
-      </w:r>
-    </w:p>
-    <w:p>
-      <w:pPr>
-        <w:pStyle w:val="Heading2"/>
-      </w:pPr>
-      <w:r>
-        <w:t>UI Components (components/ui/)</w:t>
-      </w:r>
-    </w:p>
-    <w:p>
-      <w:r>
-        <w:t>These are the most basic building blocks — the "atoms" of the website. They are generic (not specific to any one page) and can be reused anywhere.</w:t>
+        <w:t>Forms: React Hook Form + Zod for validation</w:t>
       </w:r>
     </w:p>
     <w:p>
@@ -2389,12 +120,9 @@
       </w:pPr>
       <w:r>
         <w:rPr>
-          <w:b/>
+          <w:sz w:val="19"/>
         </w:rPr>
-        <w:t xml:space="preserve">Button: </w:t>
-      </w:r>
-      <w:r>
-        <w:t>A clickable button that comes in 6 styles: default, destructive (red for danger), outline, secondary, ghost, and link. Also supports a loading spinner state. Built with class-variance-authority for variant management.</w:t>
+        <w:t>Animations: Framer Motion for drawers, modals, page transitions</w:t>
       </w:r>
     </w:p>
     <w:p>
@@ -2403,12 +131,9 @@
       </w:pPr>
       <w:r>
         <w:rPr>
-          <w:b/>
+          <w:sz w:val="19"/>
         </w:rPr>
-        <w:t xml:space="preserve">Input: </w:t>
-      </w:r>
-      <w:r>
-        <w:t>A text input field with optional label, error messages, and focus ring styling. Used in forms throughout the website.</w:t>
+        <w:t>Icons: Lucide React</w:t>
       </w:r>
     </w:p>
     <w:p>
@@ -2417,12 +142,21 @@
       </w:pPr>
       <w:r>
         <w:rPr>
-          <w:b/>
+          <w:sz w:val="19"/>
         </w:rPr>
-        <w:t xml:space="preserve">Select: </w:t>
+        <w:t>Utilities: clsx + tailwind-merge (cn() helper in lib/utils.ts)</w:t>
       </w:r>
+    </w:p>
+    <w:p/>
+    <w:p>
+      <w:pPr>
+        <w:pStyle w:val="Heading1"/>
+      </w:pPr>
       <w:r>
-        <w:t>A dropdown selection menu with label support. Used in checkout for country selection.</w:t>
+        <w:rPr>
+          <w:color w:val="143C8C"/>
+        </w:rPr>
+        <w:t>3. Folder Structure</w:t>
       </w:r>
     </w:p>
     <w:p>
@@ -2431,12 +165,9 @@
       </w:pPr>
       <w:r>
         <w:rPr>
-          <w:b/>
+          <w:sz w:val="19"/>
         </w:rPr>
-        <w:t xml:space="preserve">Modal: </w:t>
-      </w:r>
-      <w:r>
-        <w:t>A centered popup dialog with a dark backdrop. Opens with a spring animation and closes on Escape key or backdrop click.</w:t>
+        <w:t>app/  →  Next.js App Router pages and API routes</w:t>
       </w:r>
     </w:p>
     <w:p>
@@ -2445,12 +176,9 @@
       </w:pPr>
       <w:r>
         <w:rPr>
-          <w:b/>
+          <w:sz w:val="19"/>
         </w:rPr>
-        <w:t xml:space="preserve">Drawer: </w:t>
-      </w:r>
-      <w:r>
-        <w:t>A sliding panel that comes in from the left or right side. Used for mobile menus and side panels.</w:t>
+        <w:t>app/(shop)/  →  All public-facing storefront pages under shared Navbar + Footer layout</w:t>
       </w:r>
     </w:p>
     <w:p>
@@ -2459,12 +187,9 @@
       </w:pPr>
       <w:r>
         <w:rPr>
-          <w:b/>
+          <w:sz w:val="19"/>
         </w:rPr>
-        <w:t xml:space="preserve">Skeleton: </w:t>
-      </w:r>
-      <w:r>
-        <w:t>A pulsing placeholder shown while content is loading. Prevents the page from looking broken.</w:t>
+        <w:t>app/admin/  →  Admin dashboard (metrics, revenue charts)</w:t>
       </w:r>
     </w:p>
     <w:p>
@@ -2473,25 +198,9 @@
       </w:pPr>
       <w:r>
         <w:rPr>
-          <w:b/>
+          <w:sz w:val="19"/>
         </w:rPr>
-        <w:t xml:space="preserve">Toast: </w:t>
-      </w:r>
-      <w:r>
-        <w:t>A small notification that pops up at the bottom-right of the screen. Shows success (green), error (red), or info (blue) messages and auto-dismisses after 3 seconds.</w:t>
-      </w:r>
-    </w:p>
-    <w:p>
-      <w:pPr>
-        <w:pStyle w:val="Heading2"/>
-      </w:pPr>
-      <w:r>
-        <w:t>Layout Components (components/layout/)</w:t>
-      </w:r>
-    </w:p>
-    <w:p>
-      <w:r>
-        <w:t>These form the "frame" of every page — the top navigation bar and the bottom footer.</w:t>
+        <w:t>app/api/  →  Mock REST API routes: /products and /checkout</w:t>
       </w:r>
     </w:p>
     <w:p>
@@ -2500,12 +209,9 @@
       </w:pPr>
       <w:r>
         <w:rPr>
-          <w:b/>
+          <w:sz w:val="19"/>
         </w:rPr>
-        <w:t xml:space="preserve">Navbar: </w:t>
-      </w:r>
-      <w:r>
-        <w:t>The sticky top navigation bar with: announcement banner ("SUMMER SALE"), logo, mega-menus for Shop and Brands (animated with Framer Motion), search bar, dark/light theme toggle, wishlist icon with count badge, shopping bag icon with count badge, user account icon, and a mobile hamburger menu. Uses Zustand stores to read cart/wishlist/auth state.</w:t>
+        <w:t>components/ui/  →  Reusable UI: Button, Input, Modal, Drawer, Skeleton, Toast</w:t>
       </w:r>
     </w:p>
     <w:p>
@@ -2514,25 +220,9 @@
       </w:pPr>
       <w:r>
         <w:rPr>
-          <w:b/>
+          <w:sz w:val="19"/>
         </w:rPr>
-        <w:t xml:space="preserve">Footer: </w:t>
-      </w:r>
-      <w:r>
-        <w:t>The bottom section with: brand logo, social media links (Facebook, Twitter/X, Instagram, YouTube), shop category links, support links, newsletter subscription form, payment method badges, and copyright notice.</w:t>
-      </w:r>
-    </w:p>
-    <w:p>
-      <w:pPr>
-        <w:pStyle w:val="Heading2"/>
-      </w:pPr>
-      <w:r>
-        <w:t>Product Components (components/product/)</w:t>
-      </w:r>
-    </w:p>
-    <w:p>
-      <w:r>
-        <w:t>These handle how products look and behave across the website.</w:t>
+        <w:t>components/layout/  →  Navbar (sticky, mega-menu, theme toggle) and Footer</w:t>
       </w:r>
     </w:p>
     <w:p>
@@ -2541,12 +231,9 @@
       </w:pPr>
       <w:r>
         <w:rPr>
-          <w:b/>
+          <w:sz w:val="19"/>
         </w:rPr>
-        <w:t xml:space="preserve">ProductCard: </w:t>
-      </w:r>
-      <w:r>
-        <w:t>A card showing a product image, badges (New, Popular, % Off), brand name, product name, star rating, and price (with optional strikethrough for discounts). Hover reveals a "Quick Add" button and a heart icon for wishlist.</w:t>
+        <w:t>components/product/  →  ProductCard, Grid, Carousel, Gallery, Filters, PriceSlider</w:t>
       </w:r>
     </w:p>
     <w:p>
@@ -2555,12 +242,9 @@
       </w:pPr>
       <w:r>
         <w:rPr>
-          <w:b/>
+          <w:sz w:val="19"/>
         </w:rPr>
-        <w:t xml:space="preserve">ProductDetailClient: </w:t>
-      </w:r>
-      <w:r>
-        <w:t>The rich product detail page component. Includes: breadcrumb navigation, image gallery with zoom, color/size variant selectors, quantity counter, add-to-cart and wishlist buttons, trust badges (free shipping, returns, warranty), tabbed description/specifications, review submission form (with Zod validation), review list with rating breakdown, related products carousel, and recently viewed products.</w:t>
+        <w:t>components/common/  →  FAQ, Testimonials, Breadcrumb, Newsletter, BrandLogos</w:t>
       </w:r>
     </w:p>
     <w:p>
@@ -2569,12 +253,9 @@
       </w:pPr>
       <w:r>
         <w:rPr>
-          <w:b/>
+          <w:sz w:val="19"/>
         </w:rPr>
-        <w:t xml:space="preserve">ProductGallery: </w:t>
-      </w:r>
-      <w:r>
-        <w:t>Image gallery with thumbnail navigation and a zoom lens that follows your mouse cursor over the main image.</w:t>
+        <w:t>store/  →  Zustand stores with localStorage persistence</w:t>
       </w:r>
     </w:p>
     <w:p>
@@ -2583,12 +264,9 @@
       </w:pPr>
       <w:r>
         <w:rPr>
-          <w:b/>
+          <w:sz w:val="19"/>
         </w:rPr>
-        <w:t xml:space="preserve">ProductCarousel: </w:t>
-      </w:r>
-      <w:r>
-        <w:t>A horizontal scrollable row of ProductCards with left/right navigation arrows. Used on the homepage for featured products and on product pages for related products.</w:t>
+        <w:t>services/api.ts  →  Mock API client with simulated latency</w:t>
       </w:r>
     </w:p>
     <w:p>
@@ -2597,12 +275,9 @@
       </w:pPr>
       <w:r>
         <w:rPr>
-          <w:b/>
+          <w:sz w:val="19"/>
         </w:rPr>
-        <w:t xml:space="preserve">ProductGrid: </w:t>
-      </w:r>
-      <w:r>
-        <w:t>A responsive grid layout for ProductCards with an empty state message when no products match the filters.</w:t>
+        <w:t>mock/data.ts  →  Static product, review, brand, and promo datasets</w:t>
       </w:r>
     </w:p>
     <w:p>
@@ -2611,12 +286,9 @@
       </w:pPr>
       <w:r>
         <w:rPr>
-          <w:b/>
+          <w:sz w:val="19"/>
         </w:rPr>
-        <w:t xml:space="preserve">Filters: </w:t>
-      </w:r>
-      <w:r>
-        <w:t>A sidebar with category buttons, brand buttons, price range slider, and minimum rating selector. Supports a reset button and mobile-friendly close option.</w:t>
+        <w:t>types/index.ts  →  TypeScript interfaces for all domain models</w:t>
       </w:r>
     </w:p>
     <w:p>
@@ -2625,12 +297,9 @@
       </w:pPr>
       <w:r>
         <w:rPr>
-          <w:b/>
+          <w:sz w:val="19"/>
         </w:rPr>
-        <w:t xml:space="preserve">PriceSlider: </w:t>
-      </w:r>
-      <w:r>
-        <w:t>A custom range slider for filtering products by maximum price.</w:t>
+        <w:t>styles/globals.css  →  Tailwind @theme directives and CSS variable design tokens</w:t>
       </w:r>
     </w:p>
     <w:p>
@@ -2639,12 +308,30 @@
       </w:pPr>
       <w:r>
         <w:rPr>
+          <w:sz w:val="19"/>
+        </w:rPr>
+        <w:t>lib/utils.ts  →  cn() helper, formatPrice() utility</w:t>
+      </w:r>
+    </w:p>
+    <w:p/>
+    <w:p>
+      <w:pPr>
+        <w:pStyle w:val="Heading1"/>
+      </w:pPr>
+      <w:r>
+        <w:rPr>
+          <w:color w:val="143C8C"/>
+        </w:rPr>
+        <w:t>4. How Data Flows</w:t>
+      </w:r>
+    </w:p>
+    <w:p>
+      <w:r>
+        <w:rPr>
           <w:b/>
+          <w:sz w:val="20"/>
         </w:rPr>
-        <w:t xml:space="preserve">Rating: </w:t>
-      </w:r>
-      <w:r>
-        <w:t>A star rating display that shows filled stars, half stars, and empty stars based on a numeric value.</w:t>
+        <w:t>The app uses a layered architecture:</w:t>
       </w:r>
     </w:p>
     <w:p>
@@ -2653,25 +340,9 @@
       </w:pPr>
       <w:r>
         <w:rPr>
-          <w:b/>
+          <w:sz w:val="19"/>
         </w:rPr>
-        <w:t xml:space="preserve">RecentlyViewed: </w:t>
-      </w:r>
-      <w:r>
-        <w:t>Shows a carousel of the last 6 products the user viewed, stored in local storage via Zustand.</w:t>
-      </w:r>
-    </w:p>
-    <w:p>
-      <w:pPr>
-        <w:pStyle w:val="Heading2"/>
-      </w:pPr>
-      <w:r>
-        <w:t>Common Components (components/common/)</w:t>
-      </w:r>
-    </w:p>
-    <w:p>
-      <w:r>
-        <w:t>Shared feature components used across multiple pages.</w:t>
+        <w:t>mock/data.ts holds static product and content data</w:t>
       </w:r>
     </w:p>
     <w:p>
@@ -2680,12 +351,9 @@
       </w:pPr>
       <w:r>
         <w:rPr>
-          <w:b/>
+          <w:sz w:val="19"/>
         </w:rPr>
-        <w:t xml:space="preserve">Breadcrumb: </w:t>
-      </w:r>
-      <w:r>
-        <w:t>Navigation trail showing where you are (Home &gt; Products &gt; Headphones). Uses Lucide icons.</w:t>
+        <w:t>services/api.ts wraps mock data in async functions that simulate server latency</w:t>
       </w:r>
     </w:p>
     <w:p>
@@ -2694,12 +362,9 @@
       </w:pPr>
       <w:r>
         <w:rPr>
-          <w:b/>
+          <w:sz w:val="19"/>
         </w:rPr>
-        <w:t xml:space="preserve">FeatureCards: </w:t>
-      </w:r>
-      <w:r>
-        <w:t>Four cards highlighting store benefits: Free Express Shipping, 30-Day Free Returns, 2-Year Warranty, 24/7 Expert Support.</w:t>
+        <w:t>TanStack Query (useQuery) fetches and caches data in client components</w:t>
       </w:r>
     </w:p>
     <w:p>
@@ -2708,12 +373,9 @@
       </w:pPr>
       <w:r>
         <w:rPr>
-          <w:b/>
+          <w:sz w:val="19"/>
         </w:rPr>
-        <w:t xml:space="preserve">FlashSaleCountdown: </w:t>
-      </w:r>
-      <w:r>
-        <w:t>A countdown timer banner for flash sales with hours/minutes/seconds display and a gradient background.</w:t>
+        <w:t>Zustand stores manage global UI state (cart items, wishlist, auth session)</w:t>
       </w:r>
     </w:p>
     <w:p>
@@ -2722,12 +384,9 @@
       </w:pPr>
       <w:r>
         <w:rPr>
-          <w:b/>
+          <w:sz w:val="19"/>
         </w:rPr>
-        <w:t xml:space="preserve">BrandLogos: </w:t>
-      </w:r>
-      <w:r>
-        <w:t>A row of brand name logos displayed at reduced opacity for a "trusted brands" section.</w:t>
+        <w:t>Stores persist to localStorage — state survives page reloads</w:t>
       </w:r>
     </w:p>
     <w:p>
@@ -2736,12 +395,9 @@
       </w:pPr>
       <w:r>
         <w:rPr>
-          <w:b/>
+          <w:sz w:val="19"/>
         </w:rPr>
-        <w:t xml:space="preserve">Testimonials: </w:t>
-      </w:r>
-      <w:r>
-        <w:t>Customer review cards with quotes, names, roles, and avatar photos in a 3-column grid.</w:t>
+        <w:t>Server Components handle SEO metadata generation (generateMetadata)</w:t>
       </w:r>
     </w:p>
     <w:p>
@@ -2750,12 +406,21 @@
       </w:pPr>
       <w:r>
         <w:rPr>
-          <w:b/>
+          <w:sz w:val="19"/>
         </w:rPr>
-        <w:t xml:space="preserve">FAQAccordion: </w:t>
+        <w:t>Client Components handle user interactions (add to cart, reviews, checkout form)</w:t>
       </w:r>
+    </w:p>
+    <w:p/>
+    <w:p>
+      <w:pPr>
+        <w:pStyle w:val="Heading1"/>
+      </w:pPr>
       <w:r>
-        <w:t>Expandable FAQ sections using Framer Motion for smooth height animations.</w:t>
+        <w:rPr>
+          <w:color w:val="143C8C"/>
+        </w:rPr>
+        <w:t>5. Key Pages</w:t>
       </w:r>
     </w:p>
     <w:p>
@@ -2764,12 +429,9 @@
       </w:pPr>
       <w:r>
         <w:rPr>
-          <w:b/>
+          <w:sz w:val="19"/>
         </w:rPr>
-        <w:t xml:space="preserve">Newsletter: </w:t>
-      </w:r>
-      <w:r>
-        <w:t>Email subscription form with a compelling headline ("Get 10% off your first order") and loading state.</w:t>
+        <w:t>/  —  Home — Hero slider, featured collections, brands, FAQs, testimonials</w:t>
       </w:r>
     </w:p>
     <w:p>
@@ -2778,257 +440,9 @@
       </w:pPr>
       <w:r>
         <w:rPr>
-          <w:b/>
+          <w:sz w:val="19"/>
         </w:rPr>
-        <w:t xml:space="preserve">Pagination: </w:t>
-      </w:r>
-      <w:r>
-        <w:t>Page navigation buttons (Previous, numbered pages, Next) for paginated product listings.</w:t>
-      </w:r>
-    </w:p>
-    <w:p>
-      <w:r>
-        <w:br w:type="page"/>
-      </w:r>
-    </w:p>
-    <w:p>
-      <w:pPr>
-        <w:pStyle w:val="Heading1"/>
-      </w:pPr>
-      <w:r>
-        <w:t>6. How Data Flows: State Management</w:t>
-      </w:r>
-    </w:p>
-    <w:p>
-      <w:pPr>
-        <w:pBdr>
-          <w:bottom w:val="single" w:sz="6" w:space="1" w:color="999999"/>
-        </w:pBdr>
-      </w:pPr>
-    </w:p>
-    <w:p>
-      <w:r>
-        <w:t>Imagine you are at a store and you put items in your shopping basket. How does the website "remember" what you put in the basket, even if you go to a different page? This is called STATE MANAGEMENT — it is how the website keeps track of changing data.</w:t>
-      </w:r>
-    </w:p>
-    <w:p>
-      <w:r>
-        <w:t>FISTO uses Zustand, a lightweight state management library. Zustand stores are like tiny databases that live in the user's browser. Each store handles one specific type of data:</w:t>
-      </w:r>
-    </w:p>
-    <w:p>
-      <w:pPr>
-        <w:pStyle w:val="Heading2"/>
-      </w:pPr>
-      <w:r>
-        <w:t>Cart Store (store/cart.ts)</w:t>
-      </w:r>
-    </w:p>
-    <w:p>
-      <w:r>
-        <w:t>Keeps track of all items in the shopping bag. Stores: list of cart items (product + quantity + selected color/size), discount code, and discount rate. Provides functions: addToCart, removeFromCart, updateQuantity, applyDiscount, clearCart, and getTotals (calculates subtotal, discount, tax, and total). Uses Zustand's persist middleware to save to localStorage under the key "fisto-cart-storage" — so items survive page refreshes and browser restarts.</w:t>
-      </w:r>
-    </w:p>
-    <w:p>
-      <w:pPr>
-        <w:pStyle w:val="Heading2"/>
-      </w:pPr>
-      <w:r>
-        <w:t>Auth Store (store/auth.ts)</w:t>
-      </w:r>
-    </w:p>
-    <w:p>
-      <w:r>
-        <w:t>Manages user authentication. Stores: current user object and whether the user is logged in. Provides: login (creates a mock user from email), register, logout, and updateProfile. Uses mock authentication — no real backend. Persists to "fisto-auth-storage".</w:t>
-      </w:r>
-    </w:p>
-    <w:p>
-      <w:pPr>
-        <w:pStyle w:val="Heading2"/>
-      </w:pPr>
-      <w:r>
-        <w:t>Wishlist Store (store/wishlist.ts)</w:t>
-      </w:r>
-    </w:p>
-    <w:p>
-      <w:r>
-        <w:t>Stores a list of products the user has bookmarked. Provides: addToWishlist, removeFromWishlist, toggleWishlist, and isInWishlist. Persists to "fisto-wishlist-storage".</w:t>
-      </w:r>
-    </w:p>
-    <w:p>
-      <w:pPr>
-        <w:pStyle w:val="Heading2"/>
-      </w:pPr>
-      <w:r>
-        <w:t>Recently Viewed Store (store/recentlyViewed.ts)</w:t>
-      </w:r>
-    </w:p>
-    <w:p>
-      <w:r>
-        <w:t>Keeps the last 6 products the user has viewed (like a "recently watched" list). Automatically caps at 6 items. Persists to "fisto-recently-viewed".</w:t>
-      </w:r>
-    </w:p>
-    <w:p>
-      <w:pPr>
-        <w:pStyle w:val="Heading2"/>
-      </w:pPr>
-      <w:r>
-        <w:t>Toast Store (store/toast.ts)</w:t>
-      </w:r>
-    </w:p>
-    <w:p>
-      <w:r>
-        <w:t>Manages notification popups. Each toast has: id, message, type (success/error/info), and auto-dismiss duration (default 3 seconds). Does NOT persist — toasts are temporary.</w:t>
-      </w:r>
-    </w:p>
-    <w:p>
-      <w:pPr>
-        <w:pStyle w:val="Heading2"/>
-      </w:pPr>
-      <w:r>
-        <w:t>How State Flows Through the App</w:t>
-      </w:r>
-    </w:p>
-    <w:p>
-      <w:r>
-        <w:t>Here is a step-by-step example of how data flows when a user adds a product to their cart:</w:t>
-      </w:r>
-    </w:p>
-    <w:p>
-      <w:r>
-        <w:rPr>
-          <w:b/>
-        </w:rPr>
-        <w:t xml:space="preserve">Step 1: </w:t>
-      </w:r>
-      <w:r>
-        <w:t>User clicks "Add to Bag" on a ProductCard component.</w:t>
-      </w:r>
-    </w:p>
-    <w:p>
-      <w:r>
-        <w:rPr>
-          <w:b/>
-        </w:rPr>
-        <w:t xml:space="preserve">Step 2: </w:t>
-      </w:r>
-      <w:r>
-        <w:t>The ProductCard calls useCartStore((state) =&gt; state.addToCart) to get the addToCart function.</w:t>
-      </w:r>
-    </w:p>
-    <w:p>
-      <w:r>
-        <w:rPr>
-          <w:b/>
-        </w:rPr>
-        <w:t xml:space="preserve">Step 3: </w:t>
-      </w:r>
-      <w:r>
-        <w:t>addToCart receives the product, quantity, selected color, and selected size.</w:t>
-      </w:r>
-    </w:p>
-    <w:p>
-      <w:r>
-        <w:rPr>
-          <w:b/>
-        </w:rPr>
-        <w:t xml:space="preserve">Step 4: </w:t>
-      </w:r>
-      <w:r>
-        <w:t>The cart store checks if this exact product+color+size combo already exists in items[].</w:t>
-      </w:r>
-    </w:p>
-    <w:p>
-      <w:r>
-        <w:rPr>
-          <w:b/>
-        </w:rPr>
-        <w:t xml:space="preserve">Step 5: </w:t>
-      </w:r>
-      <w:r>
-        <w:t>If it exists: increments the quantity. If not: adds a new item to the array.</w:t>
-      </w:r>
-    </w:p>
-    <w:p>
-      <w:r>
-        <w:rPr>
-          <w:b/>
-        </w:rPr>
-        <w:t xml:space="preserve">Step 6: </w:t>
-      </w:r>
-      <w:r>
-        <w:t>Zustand notifies all subscribed components (like the Navbar cart badge) that the cart changed.</w:t>
-      </w:r>
-    </w:p>
-    <w:p>
-      <w:r>
-        <w:rPr>
-          <w:b/>
-        </w:rPr>
-        <w:t xml:space="preserve">Step 7: </w:t>
-      </w:r>
-      <w:r>
-        <w:t>The Navbar re-renders and shows the updated item count.</w:t>
-      </w:r>
-    </w:p>
-    <w:p>
-      <w:r>
-        <w:rPr>
-          <w:b/>
-        </w:rPr>
-        <w:t xml:space="preserve">Step 8: </w:t>
-      </w:r>
-      <w:r>
-        <w:t>The cart state is automatically saved to localStorage by the persist middleware.</w:t>
-      </w:r>
-    </w:p>
-    <w:p>
-      <w:r>
-        <w:rPr>
-          <w:b/>
-        </w:rPr>
-        <w:t xml:space="preserve">Step 9: </w:t>
-      </w:r>
-      <w:r>
-        <w:t>A Toast notification appears: "Product Name added to your bag".</w:t>
-      </w:r>
-    </w:p>
-    <w:p>
-      <w:r>
-        <w:br w:type="page"/>
-      </w:r>
-    </w:p>
-    <w:p>
-      <w:pPr>
-        <w:pStyle w:val="Heading1"/>
-      </w:pPr>
-      <w:r>
-        <w:t>7. The Brain Behind the Scenes: API Services</w:t>
-      </w:r>
-    </w:p>
-    <w:p>
-      <w:pPr>
-        <w:pBdr>
-          <w:bottom w:val="single" w:sz="6" w:space="1" w:color="999999"/>
-        </w:pBdr>
-      </w:pPr>
-    </w:p>
-    <w:p>
-      <w:r>
-        <w:t>Right now, FISTO does NOT connect to a real database or real payment system. Instead, it uses a "mock" (fake) data system. The ApiService class (in services/api.ts) acts like a middleman — it pretends to fetch data from a server, but actually reads from hardcoded fake data stored in mock/data.ts.</w:t>
-      </w:r>
-    </w:p>
-    <w:p>
-      <w:r>
-        <w:t>Think of it like a restaurant where the waiter (ApiService) takes your order and brings you food, but the kitchen (mock data) already has all the dishes pre-made. In a real version of this website, the kitchen would be replaced with an actual database.</w:t>
-      </w:r>
-    </w:p>
-    <w:p>
-      <w:pPr>
-        <w:pStyle w:val="Heading2"/>
-      </w:pPr>
-      <w:r>
-        <w:t>API Service Methods</w:t>
+        <w:t>/products  —  Catalog — Filter sidebar, grid/list toggle, sort options, pagination</w:t>
       </w:r>
     </w:p>
     <w:p>
@@ -3037,13 +451,9 @@
       </w:pPr>
       <w:r>
         <w:rPr>
-          <w:b/>
-          <w:sz w:val="20"/>
+          <w:sz w:val="19"/>
         </w:rPr>
-        <w:t xml:space="preserve">getProducts(filters?): </w:t>
-      </w:r>
-      <w:r>
-        <w:t>Returns a filtered list of products. Supports filtering by category, brand, search query, price range, and rating. Supports sorting by price (ascending/descending), rating, or latest. Simulates a 300ms network delay.</w:t>
+        <w:t>/products/[slug]  —  Product Detail — Image gallery, variant selector, reviews, add-to-cart</w:t>
       </w:r>
     </w:p>
     <w:p>
@@ -3052,13 +462,9 @@
       </w:pPr>
       <w:r>
         <w:rPr>
-          <w:b/>
-          <w:sz w:val="20"/>
+          <w:sz w:val="19"/>
         </w:rPr>
-        <w:t xml:space="preserve">getProductBySlug(slug): </w:t>
-      </w:r>
-      <w:r>
-        <w:t>Finds a single product by its URL-friendly name (slug). Returns null if not found.</w:t>
+        <w:t>/categories/[slug]  —  Category Listing — Filtered by category slug from URL</w:t>
       </w:r>
     </w:p>
     <w:p>
@@ -3067,13 +473,9 @@
       </w:pPr>
       <w:r>
         <w:rPr>
-          <w:b/>
-          <w:sz w:val="20"/>
+          <w:sz w:val="19"/>
         </w:rPr>
-        <w:t xml:space="preserve">getProductById(id): </w:t>
-      </w:r>
-      <w:r>
-        <w:t>Finds a product by its unique ID.</w:t>
+        <w:t>/cart  —  Shopping Bag — Item list, quantity, remove, promo code, totals</w:t>
       </w:r>
     </w:p>
     <w:p>
@@ -3082,13 +484,9 @@
       </w:pPr>
       <w:r>
         <w:rPr>
-          <w:b/>
-          <w:sz w:val="20"/>
+          <w:sz w:val="19"/>
         </w:rPr>
-        <w:t xml:space="preserve">getRelatedProducts(productId, categoryId): </w:t>
-      </w:r>
-      <w:r>
-        <w:t>Returns up to 4 products from the same category, excluding the current product.</w:t>
+        <w:t>/checkout  —  Checkout — Shipping + payment form with Zod/RHF validation</w:t>
       </w:r>
     </w:p>
     <w:p>
@@ -3097,13 +495,9 @@
       </w:pPr>
       <w:r>
         <w:rPr>
-          <w:b/>
-          <w:sz w:val="20"/>
+          <w:sz w:val="19"/>
         </w:rPr>
-        <w:t xml:space="preserve">getCategories(): </w:t>
-      </w:r>
-      <w:r>
-        <w:t>Returns all 5 product categories.</w:t>
+        <w:t>/search  —  Search — Query results from ?q= URL param</w:t>
       </w:r>
     </w:p>
     <w:p>
@@ -3112,13 +506,9 @@
       </w:pPr>
       <w:r>
         <w:rPr>
-          <w:b/>
-          <w:sz w:val="20"/>
+          <w:sz w:val="19"/>
         </w:rPr>
-        <w:t xml:space="preserve">getBrands(): </w:t>
-      </w:r>
-      <w:r>
-        <w:t>Returns all 5 brands.</w:t>
+        <w:t>/wishlist  —  Saved Items — Products saved via Zustand wishlist store</w:t>
       </w:r>
     </w:p>
     <w:p>
@@ -3127,13 +517,9 @@
       </w:pPr>
       <w:r>
         <w:rPr>
-          <w:b/>
-          <w:sz w:val="20"/>
+          <w:sz w:val="19"/>
         </w:rPr>
-        <w:t xml:space="preserve">getReviews(productId): </w:t>
-      </w:r>
-      <w:r>
-        <w:t>Returns all reviews for a specific product.</w:t>
+        <w:t>/account  —  Profile — Edit name/email backed by auth Zustand store</w:t>
       </w:r>
     </w:p>
     <w:p>
@@ -3142,13 +528,9 @@
       </w:pPr>
       <w:r>
         <w:rPr>
-          <w:b/>
-          <w:sz w:val="20"/>
+          <w:sz w:val="19"/>
         </w:rPr>
-        <w:t xml:space="preserve">submitReview(productId, data): </w:t>
-      </w:r>
-      <w:r>
-        <w:t>Adds a new review, recalculates the product's average rating, and returns the new review.</w:t>
+        <w:t>/account/orders  —  Order History — Mock order list</w:t>
       </w:r>
     </w:p>
     <w:p>
@@ -3157,13 +539,9 @@
       </w:pPr>
       <w:r>
         <w:rPr>
-          <w:b/>
-          <w:sz w:val="20"/>
+          <w:sz w:val="19"/>
         </w:rPr>
-        <w:t xml:space="preserve">submitNewsletter(email): </w:t>
-      </w:r>
-      <w:r>
-        <w:t>Simulates subscribing to the newsletter.</w:t>
+        <w:t>/login, /register, /forgot-password  —  Auth forms with Zod validation</w:t>
       </w:r>
     </w:p>
     <w:p>
@@ -3172,13 +550,9 @@
       </w:pPr>
       <w:r>
         <w:rPr>
-          <w:b/>
-          <w:sz w:val="20"/>
+          <w:sz w:val="19"/>
         </w:rPr>
-        <w:t xml:space="preserve">submitContact(data): </w:t>
-      </w:r>
-      <w:r>
-        <w:t>Simulates sending a contact form message.</w:t>
+        <w:t>/about, /contact, /privacy, /terms, /refund-policy, /shipping-policy  —  Static info pages</w:t>
       </w:r>
     </w:p>
     <w:p>
@@ -3187,120 +561,21 @@
       </w:pPr>
       <w:r>
         <w:rPr>
-          <w:b/>
-          <w:sz w:val="20"/>
+          <w:sz w:val="19"/>
         </w:rPr>
-        <w:t xml:space="preserve">createOrder(orderData): </w:t>
-      </w:r>
-      <w:r>
-        <w:t>Creates a mock order with a generated ID, timestamp, and tracking number.</w:t>
+        <w:t>/admin  —  Admin Dashboard — KPI cards + revenue chart (SVG)</w:t>
       </w:r>
     </w:p>
-    <w:p>
-      <w:pPr>
-        <w:pStyle w:val="Heading2"/>
-      </w:pPr>
-      <w:r>
-        <w:t>Mock Data Inventory</w:t>
-      </w:r>
-    </w:p>
-    <w:p>
-      <w:r>
-        <w:t>The mock data (mock/data.ts) contains:</w:t>
-      </w:r>
-    </w:p>
-    <w:p>
-      <w:pPr>
-        <w:pStyle w:val="ListBullet"/>
-      </w:pPr>
-      <w:r>
-        <w:t>5 Categories: Audio &amp; Sound, Wearables, Computer Gear, Desk Accessories, Lifestyle Apparel</w:t>
-      </w:r>
-    </w:p>
-    <w:p>
-      <w:pPr>
-        <w:pStyle w:val="ListBullet"/>
-      </w:pPr>
-      <w:r>
-        <w:t>5 Brands: Aura, Velo, Kore, Nox, Sol — each with a name, slug, and text-based logo</w:t>
-      </w:r>
-    </w:p>
-    <w:p>
-      <w:pPr>
-        <w:pStyle w:val="ListBullet"/>
-      </w:pPr>
-      <w:r>
-        <w:t>8 Products: Each with id, name, slug, description, long description, price, discount price, rating, reviews count, multiple images, category, brand, stock count, specifications, variants (color/size), and flags (isFeatured, isBestSeller, isLatest, isFlashSale)</w:t>
-      </w:r>
-    </w:p>
-    <w:p>
-      <w:pPr>
-        <w:pStyle w:val="ListBullet"/>
-      </w:pPr>
-      <w:r>
-        <w:t>Multiple Reviews: 3 reviews for prod-1 (headphones) and 2 reviews for prod-2 (smartwatch)</w:t>
-      </w:r>
-    </w:p>
-    <w:p>
-      <w:pPr>
-        <w:pStyle w:val="ListBullet"/>
-      </w:pPr>
-      <w:r>
-        <w:t>3 Testimonials: Quotes from fake customers with names, roles, and avatar images</w:t>
-      </w:r>
-    </w:p>
-    <w:p>
-      <w:pPr>
-        <w:pStyle w:val="ListBullet"/>
-      </w:pPr>
-      <w:r>
-        <w:t>4 FAQs: Shipping, international shipping, returns, and sustainability questions</w:t>
-      </w:r>
-    </w:p>
-    <w:p>
-      <w:pPr>
-        <w:pStyle w:val="ListBullet"/>
-      </w:pPr>
-      <w:r>
-        <w:t>3 Promo Codes: FISTO10 (10% off), PREMIUM20 (20% off), FREESHIP (free shipping)</w:t>
-      </w:r>
-    </w:p>
-    <w:p>
-      <w:r>
-        <w:br w:type="page"/>
-      </w:r>
-    </w:p>
+    <w:p/>
     <w:p>
       <w:pPr>
         <w:pStyle w:val="Heading1"/>
       </w:pPr>
       <w:r>
-        <w:t>8. How the Website Looks: Styling &amp; Design</w:t>
-      </w:r>
-    </w:p>
-    <w:p>
-      <w:pPr>
-        <w:pBdr>
-          <w:bottom w:val="single" w:sz="6" w:space="1" w:color="999999"/>
-        </w:pBdr>
-      </w:pPr>
-    </w:p>
-    <w:p>
-      <w:r>
-        <w:t>FISTO has a premium, minimalist design — think Apple's website meets a high-end fashion store. Here is how the visual design works:</w:t>
-      </w:r>
-    </w:p>
-    <w:p>
-      <w:pPr>
-        <w:pStyle w:val="Heading2"/>
-      </w:pPr>
-      <w:r>
-        <w:t>CSS Variables (Design Tokens)</w:t>
-      </w:r>
-    </w:p>
-    <w:p>
-      <w:r>
-        <w:t>The website uses CSS Custom Properties (variables) defined in styles/globals.css. These are like paint swatches — named colors that can be changed in one place to update the entire website. There are separate sets for light mode and dark mode.</w:t>
+        <w:rPr>
+          <w:color w:val="143C8C"/>
+        </w:rPr>
+        <w:t>6. SEO &amp; Performance</w:t>
       </w:r>
     </w:p>
     <w:p>
@@ -3309,12 +584,9 @@
       </w:pPr>
       <w:r>
         <w:rPr>
-          <w:b/>
+          <w:sz w:val="19"/>
         </w:rPr>
-        <w:t xml:space="preserve">Background &amp; Foreground: </w:t>
-      </w:r>
-      <w:r>
-        <w:t>The main page background and text colors</w:t>
+        <w:t>app/sitemap.ts → Dynamic XML sitemap for all routes (Static + Dynamic slugs)</w:t>
       </w:r>
     </w:p>
     <w:p>
@@ -3323,12 +595,9 @@
       </w:pPr>
       <w:r>
         <w:rPr>
-          <w:b/>
+          <w:sz w:val="19"/>
         </w:rPr>
-        <w:t xml:space="preserve">Card &amp; Popover: </w:t>
-      </w:r>
-      <w:r>
-        <w:t>Backgrounds for cards and popup elements</w:t>
+        <w:t>app/robots.ts → Blocks /checkout, /account, /admin from crawlers</w:t>
       </w:r>
     </w:p>
     <w:p>
@@ -3337,12 +606,9 @@
       </w:pPr>
       <w:r>
         <w:rPr>
-          <w:b/>
+          <w:sz w:val="19"/>
         </w:rPr>
-        <w:t xml:space="preserve">Primary: </w:t>
-      </w:r>
-      <w:r>
-        <w:t>The main brand color (dark navy in light mode, white in dark mode)</w:t>
+        <w:t>app/manifest.ts → PWA web app manifest</w:t>
       </w:r>
     </w:p>
     <w:p>
@@ -3351,12 +617,9 @@
       </w:pPr>
       <w:r>
         <w:rPr>
-          <w:b/>
+          <w:sz w:val="19"/>
         </w:rPr>
-        <w:t xml:space="preserve">Secondary: </w:t>
-      </w:r>
-      <w:r>
-        <w:t>A lighter shade for secondary backgrounds</w:t>
+        <w:t>generateMetadata() on product/category pages → per-page Open Graph tags</w:t>
       </w:r>
     </w:p>
     <w:p>
@@ -3365,12 +628,9 @@
       </w:pPr>
       <w:r>
         <w:rPr>
-          <w:b/>
+          <w:sz w:val="19"/>
         </w:rPr>
-        <w:t xml:space="preserve">Muted: </w:t>
-      </w:r>
-      <w:r>
-        <w:t>Subtle text and background colors for less important content</w:t>
+        <w:t>Server Components for initial render → Fast TTFB and LCP</w:t>
       </w:r>
     </w:p>
     <w:p>
@@ -3379,12 +639,9 @@
       </w:pPr>
       <w:r>
         <w:rPr>
-          <w:b/>
+          <w:sz w:val="19"/>
         </w:rPr>
-        <w:t xml:space="preserve">Accent: </w:t>
-      </w:r>
-      <w:r>
-        <w:t>Highlighted interactive elements</w:t>
+        <w:t>Suspense boundaries around dynamic pages → prevents SSR bailout errors</w:t>
       </w:r>
     </w:p>
     <w:p>
@@ -3393,12 +650,21 @@
       </w:pPr>
       <w:r>
         <w:rPr>
-          <w:b/>
+          <w:sz w:val="19"/>
         </w:rPr>
-        <w:t xml:space="preserve">Destructive: </w:t>
+        <w:t>next.config.ts → Unsplash remote image patterns allowed</w:t>
       </w:r>
+    </w:p>
+    <w:p/>
+    <w:p>
+      <w:pPr>
+        <w:pStyle w:val="Heading1"/>
+      </w:pPr>
       <w:r>
-        <w:t>Red color for danger/delete actions</w:t>
+        <w:rPr>
+          <w:color w:val="143C8C"/>
+        </w:rPr>
+        <w:t>7. State Management (Zustand Stores)</w:t>
       </w:r>
     </w:p>
     <w:p>
@@ -3407,12 +673,9 @@
       </w:pPr>
       <w:r>
         <w:rPr>
-          <w:b/>
+          <w:sz w:val="19"/>
         </w:rPr>
-        <w:t xml:space="preserve">Border, Input, Ring: </w:t>
-      </w:r>
-      <w:r>
-        <w:t>Colors for borders, input fields, and focus rings</w:t>
+        <w:t>store/cart.ts  →  Items[], discountRate, promo codes, add/remove/update quantity</w:t>
       </w:r>
     </w:p>
     <w:p>
@@ -3421,33 +684,9 @@
       </w:pPr>
       <w:r>
         <w:rPr>
-          <w:b/>
+          <w:sz w:val="19"/>
         </w:rPr>
-        <w:t xml:space="preserve">Radius: </w:t>
-      </w:r>
-      <w:r>
-        <w:t>0.75rem border radius for rounded corners</w:t>
-      </w:r>
-    </w:p>
-    <w:p>
-      <w:pPr>
-        <w:pStyle w:val="Heading2"/>
-      </w:pPr>
-      <w:r>
-        <w:t>Dark Mode</w:t>
-      </w:r>
-    </w:p>
-    <w:p>
-      <w:r>
-        <w:t>The website supports automatic dark mode using the "next-themes" library. It reads the user's operating system preference and can also be manually toggled with a sun/moon button in the Navbar. The dark theme inverts colors — dark backgrounds become light and vice versa.</w:t>
-      </w:r>
-    </w:p>
-    <w:p>
-      <w:pPr>
-        <w:pStyle w:val="Heading2"/>
-      </w:pPr>
-      <w:r>
-        <w:t>Special CSS Effects</w:t>
+        <w:t>store/wishlist.ts  →  Saved product IDs, add/remove toggle</w:t>
       </w:r>
     </w:p>
     <w:p>
@@ -3456,12 +695,9 @@
       </w:pPr>
       <w:r>
         <w:rPr>
-          <w:b/>
+          <w:sz w:val="19"/>
         </w:rPr>
-        <w:t xml:space="preserve">Glassmorphism: </w:t>
-      </w:r>
-      <w:r>
-        <w:t>A frosted glass effect using backdrop-filter: blur(12px) with semi-transparent backgrounds. Used for elegant overlays.</w:t>
+        <w:t>store/auth.ts  →  Mock user session — login, logout, profile updates</w:t>
       </w:r>
     </w:p>
     <w:p>
@@ -3470,12 +706,9 @@
       </w:pPr>
       <w:r>
         <w:rPr>
-          <w:b/>
+          <w:sz w:val="19"/>
         </w:rPr>
-        <w:t xml:space="preserve">Custom Scrollbar: </w:t>
-      </w:r>
-      <w:r>
-        <w:t>Slim 8px scrollbars with rounded thumbs that change opacity on hover. Different colors for light and dark mode.</w:t>
+        <w:t>store/toast.ts  →  Global notification dispatch (success/error toasts)</w:t>
       </w:r>
     </w:p>
     <w:p>
@@ -3484,12 +717,21 @@
       </w:pPr>
       <w:r>
         <w:rPr>
-          <w:b/>
+          <w:sz w:val="19"/>
         </w:rPr>
-        <w:t xml:space="preserve">Animated Transitions: </w:t>
+        <w:t>store/recentlyViewed.ts  →  Last 6 viewed products (persisted to localStorage)</w:t>
       </w:r>
+    </w:p>
+    <w:p/>
+    <w:p>
+      <w:pPr>
+        <w:pStyle w:val="Heading1"/>
+      </w:pPr>
       <w:r>
-        <w:t>Smooth 300ms transitions on hover states, focus rings, and interactive elements.</w:t>
+        <w:rPr>
+          <w:color w:val="143C8C"/>
+        </w:rPr>
+        <w:t>8. Important Patterns Used</w:t>
       </w:r>
     </w:p>
     <w:p>
@@ -3498,12 +740,9 @@
       </w:pPr>
       <w:r>
         <w:rPr>
-          <w:b/>
+          <w:sz w:val="19"/>
         </w:rPr>
-        <w:t xml:space="preserve">Grid Background Pattern: </w:t>
-      </w:r>
-      <w:r>
-        <w:t>The hero section has a subtle grid pattern created with CSS linear-gradients.</w:t>
+        <w:t>Hydration Safety: Zustand stores use mounted checks before reading localStorage to prevent SSR mismatches</w:t>
       </w:r>
     </w:p>
     <w:p>
@@ -3512,167 +751,9 @@
       </w:pPr>
       <w:r>
         <w:rPr>
-          <w:b/>
+          <w:sz w:val="19"/>
         </w:rPr>
-        <w:t xml:space="preserve">Decorative Blur Orbs: </w:t>
-      </w:r>
-      <w:r>
-        <w:t>Large colored circles (violet, emerald) with heavy blur (blur-3xl) behind the hero section for a modern aesthetic.</w:t>
-      </w:r>
-    </w:p>
-    <w:p>
-      <w:pPr>
-        <w:pStyle w:val="Heading2"/>
-      </w:pPr>
-      <w:r>
-        <w:t>Typography</w:t>
-      </w:r>
-    </w:p>
-    <w:p>
-      <w:r>
-        <w:t>The website uses Google's Geist font family (both Sans and Mono variants) loaded via next/font/google. The font variables are set as CSS custom properties (--font-geist-sans and --font-geist-mono). The design uses bold headings with tight tracking (letter-spacing) and a clear typographic hierarchy.</w:t>
-      </w:r>
-    </w:p>
-    <w:p>
-      <w:pPr>
-        <w:pStyle w:val="Heading2"/>
-      </w:pPr>
-      <w:r>
-        <w:t>Responsive Design</w:t>
-      </w:r>
-    </w:p>
-    <w:p>
-      <w:r>
-        <w:t>The website is fully responsive using Tailwind CSS breakpoints. Mobile-first approach with sm: (640px), md: (768px), and lg: (1024px) breakpoints. The Navbar has a mobile hamburger menu, the product grid adjusts from 1 column on mobile to 3-4 on desktop, and the checkout page stacks vertically on mobile.</w:t>
-      </w:r>
-    </w:p>
-    <w:p>
-      <w:r>
-        <w:br w:type="page"/>
-      </w:r>
-    </w:p>
-    <w:p>
-      <w:pPr>
-        <w:pStyle w:val="Heading1"/>
-      </w:pPr>
-      <w:r>
-        <w:t>9. How It All Connects: Architecture Diagram</w:t>
-      </w:r>
-    </w:p>
-    <w:p>
-      <w:pPr>
-        <w:pBdr>
-          <w:bottom w:val="single" w:sz="6" w:space="1" w:color="999999"/>
-        </w:pBdr>
-      </w:pPr>
-    </w:p>
-    <w:p>
-      <w:r>
-        <w:t>Here is how the major parts of the website connect to each other. Think of it like a flowchart showing how information moves:</w:t>
-      </w:r>
-    </w:p>
-    <w:p>
-      <w:pPr>
-        <w:pStyle w:val="Heading2"/>
-      </w:pPr>
-      <w:r>
-        <w:t>The Data Flow Architecture</w:t>
-      </w:r>
-    </w:p>
-    <w:p>
-      <w:r>
-        <w:rPr>
-          <w:b/>
-        </w:rPr>
-        <w:t xml:space="preserve">1. Browser (User) — </w:t>
-      </w:r>
-      <w:r>
-        <w:t>The person using the website. They click buttons, fill forms, and view pages.</w:t>
-      </w:r>
-    </w:p>
-    <w:p>
-      <w:r>
-        <w:rPr>
-          <w:b/>
-        </w:rPr>
-        <w:t xml:space="preserve">2. Next.js Pages (app/) — </w:t>
-      </w:r>
-      <w:r>
-        <w:t>The pages the user sees. Some pages are rendered on the server (SSR) for speed, and some on the client for interactivity.</w:t>
-      </w:r>
-    </w:p>
-    <w:p>
-      <w:r>
-        <w:rPr>
-          <w:b/>
-        </w:rPr>
-        <w:t xml:space="preserve">3. React Components (components/) — </w:t>
-      </w:r>
-      <w:r>
-        <w:t>The visual building blocks that make up each page. They display data and handle user interactions.</w:t>
-      </w:r>
-    </w:p>
-    <w:p>
-      <w:r>
-        <w:rPr>
-          <w:b/>
-        </w:rPr>
-        <w:t xml:space="preserve">4. Zustand Stores (store/) — </w:t>
-      </w:r>
-      <w:r>
-        <w:t>The "memory banks" that hold the current state — what's in the cart, who's logged in, what's on the wishlist.</w:t>
-      </w:r>
-    </w:p>
-    <w:p>
-      <w:r>
-        <w:rPr>
-          <w:b/>
-        </w:rPr>
-        <w:t xml:space="preserve">5. API Service (services/api.ts) — </w:t>
-      </w:r>
-      <w:r>
-        <w:t>The data provider that fetches product info, handles orders, and processes form submissions.</w:t>
-      </w:r>
-    </w:p>
-    <w:p>
-      <w:r>
-        <w:rPr>
-          <w:b/>
-        </w:rPr>
-        <w:t xml:space="preserve">6. Mock Data (mock/data.ts) — </w:t>
-      </w:r>
-      <w:r>
-        <w:t>The fake database that holds all the product, category, brand, and review data.</w:t>
-      </w:r>
-    </w:p>
-    <w:p>
-      <w:r>
-        <w:rPr>
-          <w:b/>
-        </w:rPr>
-        <w:t xml:space="preserve">7. Type Definitions (types/) — </w:t>
-      </w:r>
-      <w:r>
-        <w:t>The "blueprints" that define the shape of every piece of data — ensuring everything fits together correctly.</w:t>
-      </w:r>
-    </w:p>
-    <w:p/>
-    <w:p>
-      <w:r>
-        <w:t>In a real-world version of this website, Mock Data would be replaced by a real database (like PostgreSQL or MongoDB), the API Service would make actual HTTP requests to a backend server, and Authentication would use real JWT tokens or session cookies instead of mock users.</w:t>
-      </w:r>
-    </w:p>
-    <w:p>
-      <w:pPr>
-        <w:pStyle w:val="Heading2"/>
-      </w:pPr>
-      <w:r>
-        <w:t>Rendering Strategy</w:t>
-      </w:r>
-    </w:p>
-    <w:p>
-      <w:r>
-        <w:t>FISTO uses a hybrid rendering approach:</w:t>
+        <w:t>Suspense Wrapping: useSearchParams() components wrapped in &lt;Suspense&gt; to prevent static generation bailout</w:t>
       </w:r>
     </w:p>
     <w:p>
@@ -3681,12 +762,9 @@
       </w:pPr>
       <w:r>
         <w:rPr>
-          <w:b/>
+          <w:sz w:val="19"/>
         </w:rPr>
-        <w:t xml:space="preserve">Server-Side Rendering (SSR): </w:t>
-      </w:r>
-      <w:r>
-        <w:t>The homepage uses `export const revalidate = 3600` for Incremental Static Regeneration (ISR) — the page is pre-rendered on the server and cached for 1 hour. Product detail pages also use server components to fetch data before rendering.</w:t>
+        <w:t>useMemo for Selectors: Cart totals computed with useMemo instead of calling getter functions inside Zustand selectors (prevents infinite loops)</w:t>
       </w:r>
     </w:p>
     <w:p>
@@ -3695,12 +773,9 @@
       </w:pPr>
       <w:r>
         <w:rPr>
-          <w:b/>
+          <w:sz w:val="19"/>
         </w:rPr>
-        <w:t xml:space="preserve">Client-Side Rendering (CSR): </w:t>
-      </w:r>
-      <w:r>
-        <w:t>Interactive components like the Navbar, Cart, Checkout, and Filters use "use client" directives. These run in the browser and can respond to user interactions.</w:t>
+        <w:t>cn() Utility: All className strings use cn(clsx(), twMerge()) for clean conditional class composition</w:t>
       </w:r>
     </w:p>
     <w:p>
@@ -3709,195 +784,30 @@
       </w:pPr>
       <w:r>
         <w:rPr>
-          <w:b/>
+          <w:sz w:val="19"/>
         </w:rPr>
-        <w:t xml:space="preserve">Static Pages: </w:t>
-      </w:r>
-      <w:r>
-        <w:t>Pages like About, Privacy, and Terms are fully static — they don't need any dynamic data and load instantly.</w:t>
+        <w:t>Dynamic Metadata: Server components export generateMetadata() for page-specific SEO head tags</w:t>
       </w:r>
     </w:p>
-    <w:p>
-      <w:r>
-        <w:br w:type="page"/>
-      </w:r>
-    </w:p>
+    <w:p/>
     <w:p>
       <w:pPr>
         <w:pStyle w:val="Heading1"/>
       </w:pPr>
       <w:r>
-        <w:t>10. Special Features &amp; Cool Things It Does</w:t>
-      </w:r>
-    </w:p>
-    <w:p>
-      <w:pPr>
-        <w:pBdr>
-          <w:bottom w:val="single" w:sz="6" w:space="1" w:color="999999"/>
-        </w:pBdr>
-      </w:pPr>
-    </w:p>
-    <w:p>
-      <w:pPr>
-        <w:pStyle w:val="Heading2"/>
-      </w:pPr>
-      <w:r>
-        <w:t>Mega Menu Navigation</w:t>
+        <w:rPr>
+          <w:color w:val="143C8C"/>
+        </w:rPr>
+        <w:t>9. Build Output (26 Routes)</w:t>
       </w:r>
     </w:p>
     <w:p>
       <w:r>
-        <w:t>The Shop and Brands dropdown menus in the Navbar are "mega menus" — large, animated panels that show multiple columns of links and featured content. They open smoothly using Framer Motion's AnimatePresence with a 150ms slide-down animation.</w:t>
-      </w:r>
-    </w:p>
-    <w:p>
-      <w:pPr>
-        <w:pStyle w:val="Heading2"/>
-      </w:pPr>
-      <w:r>
-        <w:t>Product Image Zoom</w:t>
-      </w:r>
-    </w:p>
-    <w:p>
-      <w:r>
-        <w:t>On the product detail page, hovering over the main image shows a 200% zoom overlay that follows your mouse cursor, letting you see fine details of the product.</w:t>
-      </w:r>
-    </w:p>
-    <w:p>
-      <w:pPr>
-        <w:pStyle w:val="Heading2"/>
-      </w:pPr>
-      <w:r>
-        <w:t>Flash Sale Countdown Timer</w:t>
-      </w:r>
-    </w:p>
-    <w:p>
-      <w:r>
-        <w:t>A live countdown timer that ticks every second, showing hours, minutes, and seconds remaining. Creates urgency for limited-time deals.</w:t>
-      </w:r>
-    </w:p>
-    <w:p>
-      <w:pPr>
-        <w:pStyle w:val="Heading2"/>
-      </w:pPr>
-      <w:r>
-        <w:t>Smart Cart Calculations</w:t>
-      </w:r>
-    </w:p>
-    <w:p>
-      <w:r>
-        <w:t>The cart automatically calculates subtotal, applies discount codes, adds 10% tax, and shows a running total. It handles discount price vs regular price for each item.</w:t>
-      </w:r>
-    </w:p>
-    <w:p>
-      <w:pPr>
-        <w:pStyle w:val="Heading2"/>
-      </w:pPr>
-      <w:r>
-        <w:t>Form Validation with Zod</w:t>
-      </w:r>
-    </w:p>
-    <w:p>
-      <w:r>
-        <w:t>Both the review submission form and the checkout form use Zod schemas for strict validation. For example, the checkout form validates: email format, minimum character lengths for names and addresses, 16-digit card numbers, MM/YY expiry format, and 3-4 digit CVC codes.</w:t>
-      </w:r>
-    </w:p>
-    <w:p>
-      <w:pPr>
-        <w:pStyle w:val="Heading2"/>
-      </w:pPr>
-      <w:r>
-        <w:t>Optimistic UI Updates</w:t>
-      </w:r>
-    </w:p>
-    <w:p>
-      <w:r>
-        <w:t>When you add an item to the cart or toggle your wishlist, the UI updates instantly before any "server" response. This makes the website feel snappy and responsive.</w:t>
-      </w:r>
-    </w:p>
-    <w:p>
-      <w:pPr>
-        <w:pStyle w:val="Heading2"/>
-      </w:pPr>
-      <w:r>
-        <w:t>Hydration Safety</w:t>
-      </w:r>
-    </w:p>
-    <w:p>
-      <w:r>
-        <w:t>Components that read from localStorage (like Cart, Wishlist, Checkout) use a "mounted" state pattern to avoid hydration mismatches — they show a loading skeleton until the component has mounted in the browser.</w:t>
-      </w:r>
-    </w:p>
-    <w:p>
-      <w:pPr>
-        <w:pStyle w:val="Heading2"/>
-      </w:pPr>
-      <w:r>
-        <w:t>Dynamic Metadata</w:t>
-      </w:r>
-    </w:p>
-    <w:p>
-      <w:r>
-        <w:t>Product pages use Next.js's generateMetadata() to set page-specific title, description, Open Graph image, and Twitter card data for social media sharing.</w:t>
-      </w:r>
-    </w:p>
-    <w:p>
-      <w:pPr>
-        <w:pStyle w:val="Heading2"/>
-      </w:pPr>
-      <w:r>
-        <w:t>SVG Analytics Chart</w:t>
-      </w:r>
-    </w:p>
-    <w:p>
-      <w:r>
-        <w:t>The admin dashboard features a hand-crafted SVG line chart showing weekly revenue trends, with gradient fills and animated data points — no external charting library needed.</w:t>
-      </w:r>
-    </w:p>
-    <w:p>
-      <w:pPr>
-        <w:pStyle w:val="Heading2"/>
-      </w:pPr>
-      <w:r>
-        <w:t>Toast Notification System</w:t>
-      </w:r>
-    </w:p>
-    <w:p>
-      <w:r>
-        <w:t>A global notification system using Zustand that supports 3 types (success, error, info), auto-dismiss, manual close, and smooth enter/exit animations.</w:t>
-      </w:r>
-    </w:p>
-    <w:p>
-      <w:r>
-        <w:br w:type="page"/>
-      </w:r>
-    </w:p>
-    <w:p>
-      <w:pPr>
-        <w:pStyle w:val="Heading1"/>
-      </w:pPr>
-      <w:r>
-        <w:t>11. Security &amp; SEO: Being Found and Protected</w:t>
-      </w:r>
-    </w:p>
-    <w:p>
-      <w:pPr>
-        <w:pBdr>
-          <w:bottom w:val="single" w:sz="6" w:space="1" w:color="999999"/>
-        </w:pBdr>
-      </w:pPr>
-    </w:p>
-    <w:p>
-      <w:pPr>
-        <w:pStyle w:val="Heading2"/>
-      </w:pPr>
-      <w:r>
-        <w:t>Search Engine Optimization (SEO)</w:t>
-      </w:r>
-    </w:p>
-    <w:p>
-      <w:r>
-        <w:t>SEO is how Google and other search engines find your website and show it to people who are searching for products like yours. FISTO has several SEO features:</w:t>
+        <w:rPr>
+          <w:b w:val="0"/>
+          <w:sz w:val="20"/>
+        </w:rPr>
+        <w:t>npm run build produces:</w:t>
       </w:r>
     </w:p>
     <w:p>
@@ -3906,12 +816,9 @@
       </w:pPr>
       <w:r>
         <w:rPr>
-          <w:b/>
+          <w:sz w:val="19"/>
         </w:rPr>
-        <w:t xml:space="preserve">Dynamic Sitemap (app/sitemap.ts): </w:t>
-      </w:r>
-      <w:r>
-        <w:t>Automatically generates a sitemap.xml file listing all pages — static pages, category pages, and individual product pages. This helps search engines discover all content.</w:t>
+        <w:t>20 Static (○) routes — pre-rendered HTML at build time</w:t>
       </w:r>
     </w:p>
     <w:p>
@@ -3920,12 +827,39 @@
       </w:pPr>
       <w:r>
         <w:rPr>
-          <w:b/>
+          <w:sz w:val="19"/>
         </w:rPr>
-        <w:t xml:space="preserve">Robots.txt (app/robots.ts): </w:t>
+        <w:t>6 Dynamic (ƒ) routes — SSR on demand: /products/[slug], /categories/[slug], /account/orders/[id], /api/checkout, /api/products</w:t>
       </w:r>
+    </w:p>
+    <w:p>
       <w:r>
-        <w:t>Tells search engine bots which pages to crawl (/ = yes) and which to skip (/admin, /checkout, /account = no).</w:t>
+        <w:rPr>
+          <w:b w:val="0"/>
+          <w:sz w:val="20"/>
+        </w:rPr>
+        <w:t>All TypeScript types pass strict checks. No lint errors.</w:t>
+      </w:r>
+    </w:p>
+    <w:p/>
+    <w:p>
+      <w:pPr>
+        <w:pStyle w:val="Heading1"/>
+      </w:pPr>
+      <w:r>
+        <w:rPr>
+          <w:color w:val="143C8C"/>
+        </w:rPr>
+        <w:t>10. Running the Project</w:t>
+      </w:r>
+    </w:p>
+    <w:p>
+      <w:r>
+        <w:rPr>
+          <w:b w:val="0"/>
+          <w:sz w:val="20"/>
+        </w:rPr>
+        <w:t>Install dependencies:</w:t>
       </w:r>
     </w:p>
     <w:p>
@@ -3934,12 +868,18 @@
       </w:pPr>
       <w:r>
         <w:rPr>
-          <w:b/>
+          <w:sz w:val="19"/>
         </w:rPr>
-        <w:t xml:space="preserve">Open Graph Tags: </w:t>
+        <w:t>npm install</w:t>
       </w:r>
+    </w:p>
+    <w:p>
       <w:r>
-        <w:t>The root layout includes comprehensive Open Graph and Twitter Card metadata for rich social media previews when links are shared.</w:t>
+        <w:rPr>
+          <w:b w:val="0"/>
+          <w:sz w:val="20"/>
+        </w:rPr>
+        <w:t>Start development server:</w:t>
       </w:r>
     </w:p>
     <w:p>
@@ -3948,12 +888,18 @@
       </w:pPr>
       <w:r>
         <w:rPr>
-          <w:b/>
+          <w:sz w:val="19"/>
         </w:rPr>
-        <w:t xml:space="preserve">Dynamic Metadata: </w:t>
+        <w:t>npm run dev  →  http://localhost:3000</w:t>
       </w:r>
+    </w:p>
+    <w:p>
       <w:r>
-        <w:t>Each product page generates its own title, description, and preview image using Next.js's generateMetadata() function.</w:t>
+        <w:rPr>
+          <w:b w:val="0"/>
+          <w:sz w:val="20"/>
+        </w:rPr>
+        <w:t>Production build:</w:t>
       </w:r>
     </w:p>
     <w:p>
@@ -3962,12 +908,9 @@
       </w:pPr>
       <w:r>
         <w:rPr>
-          <w:b/>
+          <w:sz w:val="19"/>
         </w:rPr>
-        <w:t xml:space="preserve">Semantic HTML: </w:t>
-      </w:r>
-      <w:r>
-        <w:t>The website uses proper heading hierarchy (h1, h2, h3), ARIA labels on interactive elements, and semantic HTML tags for accessibility.</w:t>
+        <w:t>npm run build</w:t>
       </w:r>
     </w:p>
     <w:p>
@@ -3976,473 +919,14 @@
       </w:pPr>
       <w:r>
         <w:rPr>
-          <w:b/>
+          <w:sz w:val="19"/>
         </w:rPr>
-        <w:t xml:space="preserve">PWA Manifest (app/manifest.ts): </w:t>
-      </w:r>
-      <w:r>
-        <w:t>Includes a web app manifest for Progressive Web App support, allowing users to "install" the website on their device.</w:t>
-      </w:r>
-    </w:p>
-    <w:p>
-      <w:pPr>
-        <w:pStyle w:val="Heading2"/>
-      </w:pPr>
-      <w:r>
-        <w:t>Security Considerations</w:t>
-      </w:r>
-    </w:p>
-    <w:p>
-      <w:r>
-        <w:t>Since FISTO is currently a demo/prototype with mock data, there are no real security measures for payment processing or user authentication. However, the architecture is set up to easily integrate real security:</w:t>
-      </w:r>
-    </w:p>
-    <w:p>
-      <w:pPr>
-        <w:pStyle w:val="ListBullet"/>
-      </w:pPr>
-      <w:r>
-        <w:t>Payment form uses client-side validation but does NOT send real card data to any server</w:t>
-      </w:r>
-    </w:p>
-    <w:p>
-      <w:pPr>
-        <w:pStyle w:val="ListBullet"/>
-      </w:pPr>
-      <w:r>
-        <w:t>Authentication is mocked — login creates a fake user object without any real credentials</w:t>
-      </w:r>
-    </w:p>
-    <w:p>
-      <w:pPr>
-        <w:pStyle w:val="ListBullet"/>
-      </w:pPr>
-      <w:r>
-        <w:t>The checkout API route (POST /api/checkout) validates that the cart is not empty before processing</w:t>
-      </w:r>
-    </w:p>
-    <w:p>
-      <w:pPr>
-        <w:pStyle w:val="ListBullet"/>
-      </w:pPr>
-      <w:r>
-        <w:t>Environment variables would be used for API keys and secrets in a production version</w:t>
-      </w:r>
-    </w:p>
-    <w:p>
-      <w:pPr>
-        <w:pStyle w:val="ListBullet"/>
-      </w:pPr>
-      <w:r>
-        <w:t>The checkout page includes a "Secure Transactions" badge mentioning SSL encryption</w:t>
-      </w:r>
-    </w:p>
-    <w:p>
-      <w:r>
-        <w:br w:type="page"/>
-      </w:r>
-    </w:p>
-    <w:p>
-      <w:pPr>
-        <w:pStyle w:val="Heading1"/>
-      </w:pPr>
-      <w:r>
-        <w:t>12. Summary: Everything at a Glance</w:t>
-      </w:r>
-    </w:p>
-    <w:p>
-      <w:pPr>
-        <w:pBdr>
-          <w:bottom w:val="single" w:sz="6" w:space="1" w:color="999999"/>
-        </w:pBdr>
-      </w:pPr>
-    </w:p>
-    <w:tbl>
-      <w:tblPr>
-        <w:tblStyle w:val="TableGrid"/>
-        <w:tblW w:type="auto" w:w="0"/>
-        <w:jc w:val="center"/>
-        <w:tblLook w:firstColumn="1" w:firstRow="1" w:lastColumn="0" w:lastRow="0" w:noHBand="0" w:noVBand="1" w:val="04A0"/>
-      </w:tblPr>
-      <w:tblGrid>
-        <w:gridCol w:w="4703"/>
-        <w:gridCol w:w="4703"/>
-      </w:tblGrid>
-      <w:tr>
-        <w:tc>
-          <w:tcPr>
-            <w:tcW w:type="dxa" w:w="4703"/>
-            <w:shd w:fill="1a1a2e" w:val="clear"/>
-          </w:tcPr>
-          <w:p>
-            <w:r>
-              <w:rPr>
-                <w:b/>
-                <w:color w:val="FFFFFF"/>
-              </w:rPr>
-              <w:t>Aspect</w:t>
-            </w:r>
-          </w:p>
-        </w:tc>
-        <w:tc>
-          <w:tcPr>
-            <w:tcW w:type="dxa" w:w="4703"/>
-            <w:shd w:fill="1a1a2e" w:val="clear"/>
-          </w:tcPr>
-          <w:p>
-            <w:r>
-              <w:rPr>
-                <w:b/>
-                <w:color w:val="FFFFFF"/>
-              </w:rPr>
-              <w:t>Details</w:t>
-            </w:r>
-          </w:p>
-        </w:tc>
-      </w:tr>
-      <w:tr>
-        <w:tc>
-          <w:tcPr>
-            <w:tcW w:type="dxa" w:w="4703"/>
-          </w:tcPr>
-          <w:p>
-            <w:r>
-              <w:rPr>
-                <w:b/>
-              </w:rPr>
-              <w:t>Project Name</w:t>
-            </w:r>
-          </w:p>
-        </w:tc>
-        <w:tc>
-          <w:tcPr>
-            <w:tcW w:type="dxa" w:w="4703"/>
-          </w:tcPr>
-          <w:p>
-            <w:r>
-              <w:t>FISTO — Modern Premium E-Commerce Experience</w:t>
-            </w:r>
-          </w:p>
-        </w:tc>
-      </w:tr>
-      <w:tr>
-        <w:tc>
-          <w:tcPr>
-            <w:tcW w:type="dxa" w:w="4703"/>
-            <w:shd w:fill="f5f5f5" w:val="clear"/>
-          </w:tcPr>
-          <w:p>
-            <w:r>
-              <w:rPr>
-                <w:b/>
-              </w:rPr>
-              <w:t>Framework</w:t>
-            </w:r>
-          </w:p>
-        </w:tc>
-        <w:tc>
-          <w:tcPr>
-            <w:tcW w:type="dxa" w:w="4703"/>
-            <w:shd w:fill="f5f5f5" w:val="clear"/>
-          </w:tcPr>
-          <w:p>
-            <w:r>
-              <w:t>Next.js 16 with React 19 and TypeScript</w:t>
-            </w:r>
-          </w:p>
-        </w:tc>
-      </w:tr>
-      <w:tr>
-        <w:tc>
-          <w:tcPr>
-            <w:tcW w:type="dxa" w:w="4703"/>
-          </w:tcPr>
-          <w:p>
-            <w:r>
-              <w:rPr>
-                <w:b/>
-              </w:rPr>
-              <w:t>Styling</w:t>
-            </w:r>
-          </w:p>
-        </w:tc>
-        <w:tc>
-          <w:tcPr>
-            <w:tcW w:type="dxa" w:w="4703"/>
-          </w:tcPr>
-          <w:p>
-            <w:r>
-              <w:t>Tailwind CSS 4 with CSS custom properties and dark mode</w:t>
-            </w:r>
-          </w:p>
-        </w:tc>
-      </w:tr>
-      <w:tr>
-        <w:tc>
-          <w:tcPr>
-            <w:tcW w:type="dxa" w:w="4703"/>
-            <w:shd w:fill="f5f5f5" w:val="clear"/>
-          </w:tcPr>
-          <w:p>
-            <w:r>
-              <w:rPr>
-                <w:b/>
-              </w:rPr>
-              <w:t>State Management</w:t>
-            </w:r>
-          </w:p>
-        </w:tc>
-        <w:tc>
-          <w:tcPr>
-            <w:tcW w:type="dxa" w:w="4703"/>
-            <w:shd w:fill="f5f5f5" w:val="clear"/>
-          </w:tcPr>
-          <w:p>
-            <w:r>
-              <w:t>Zustand with localStorage persistence (5 stores)</w:t>
-            </w:r>
-          </w:p>
-        </w:tc>
-      </w:tr>
-      <w:tr>
-        <w:tc>
-          <w:tcPr>
-            <w:tcW w:type="dxa" w:w="4703"/>
-          </w:tcPr>
-          <w:p>
-            <w:r>
-              <w:rPr>
-                <w:b/>
-              </w:rPr>
-              <w:t>Data Fetching</w:t>
-            </w:r>
-          </w:p>
-        </w:tc>
-        <w:tc>
-          <w:tcPr>
-            <w:tcW w:type="dxa" w:w="4703"/>
-          </w:tcPr>
-          <w:p>
-            <w:r>
-              <w:t>React Query + mock API service with simulated latency</w:t>
-            </w:r>
-          </w:p>
-        </w:tc>
-      </w:tr>
-      <w:tr>
-        <w:tc>
-          <w:tcPr>
-            <w:tcW w:type="dxa" w:w="4703"/>
-            <w:shd w:fill="f5f5f5" w:val="clear"/>
-          </w:tcPr>
-          <w:p>
-            <w:r>
-              <w:rPr>
-                <w:b/>
-              </w:rPr>
-              <w:t>Forms &amp; Validation</w:t>
-            </w:r>
-          </w:p>
-        </w:tc>
-        <w:tc>
-          <w:tcPr>
-            <w:tcW w:type="dxa" w:w="4703"/>
-            <w:shd w:fill="f5f5f5" w:val="clear"/>
-          </w:tcPr>
-          <w:p>
-            <w:r>
-              <w:t>React Hook Form + Zod schemas</w:t>
-            </w:r>
-          </w:p>
-        </w:tc>
-      </w:tr>
-      <w:tr>
-        <w:tc>
-          <w:tcPr>
-            <w:tcW w:type="dxa" w:w="4703"/>
-          </w:tcPr>
-          <w:p>
-            <w:r>
-              <w:rPr>
-                <w:b/>
-              </w:rPr>
-              <w:t>Animations</w:t>
-            </w:r>
-          </w:p>
-        </w:tc>
-        <w:tc>
-          <w:tcPr>
-            <w:tcW w:type="dxa" w:w="4703"/>
-          </w:tcPr>
-          <w:p>
-            <w:r>
-              <w:t>Framer Motion (modals, drawers, menus, accordions, toasts)</w:t>
-            </w:r>
-          </w:p>
-        </w:tc>
-      </w:tr>
-      <w:tr>
-        <w:tc>
-          <w:tcPr>
-            <w:tcW w:type="dxa" w:w="4703"/>
-            <w:shd w:fill="f5f5f5" w:val="clear"/>
-          </w:tcPr>
-          <w:p>
-            <w:r>
-              <w:rPr>
-                <w:b/>
-              </w:rPr>
-              <w:t>Icons</w:t>
-            </w:r>
-          </w:p>
-        </w:tc>
-        <w:tc>
-          <w:tcPr>
-            <w:tcW w:type="dxa" w:w="4703"/>
-            <w:shd w:fill="f5f5f5" w:val="clear"/>
-          </w:tcPr>
-          <w:p>
-            <w:r>
-              <w:t>Lucide React (60+ icons used throughout)</w:t>
-            </w:r>
-          </w:p>
-        </w:tc>
-      </w:tr>
-      <w:tr>
-        <w:tc>
-          <w:tcPr>
-            <w:tcW w:type="dxa" w:w="4703"/>
-          </w:tcPr>
-          <w:p>
-            <w:r>
-              <w:rPr>
-                <w:b/>
-              </w:rPr>
-              <w:t>Pages</w:t>
-            </w:r>
-          </w:p>
-        </w:tc>
-        <w:tc>
-          <w:tcPr>
-            <w:tcW w:type="dxa" w:w="4703"/>
-          </w:tcPr>
-          <w:p>
-            <w:r>
-              <w:t>20 pages (17 customer-facing, 1 admin, 2 API routes)</w:t>
-            </w:r>
-          </w:p>
-        </w:tc>
-      </w:tr>
-      <w:tr>
-        <w:tc>
-          <w:tcPr>
-            <w:tcW w:type="dxa" w:w="4703"/>
-            <w:shd w:fill="f5f5f5" w:val="clear"/>
-          </w:tcPr>
-          <w:p>
-            <w:r>
-              <w:rPr>
-                <w:b/>
-              </w:rPr>
-              <w:t>Components</w:t>
-            </w:r>
-          </w:p>
-        </w:tc>
-        <w:tc>
-          <w:tcPr>
-            <w:tcW w:type="dxa" w:w="4703"/>
-            <w:shd w:fill="f5f5f5" w:val="clear"/>
-          </w:tcPr>
-          <w:p>
-            <w:r>
-              <w:t>25+ reusable components in 4 categories</w:t>
-            </w:r>
-          </w:p>
-        </w:tc>
-      </w:tr>
-      <w:tr>
-        <w:tc>
-          <w:tcPr>
-            <w:tcW w:type="dxa" w:w="4703"/>
-          </w:tcPr>
-          <w:p>
-            <w:r>
-              <w:rPr>
-                <w:b/>
-              </w:rPr>
-              <w:t>Products</w:t>
-            </w:r>
-          </w:p>
-        </w:tc>
-        <w:tc>
-          <w:tcPr>
-            <w:tcW w:type="dxa" w:w="4703"/>
-          </w:tcPr>
-          <w:p>
-            <w:r>
-              <w:t>8 products across 5 categories and 5 brands</w:t>
-            </w:r>
-          </w:p>
-        </w:tc>
-      </w:tr>
-      <w:tr>
-        <w:tc>
-          <w:tcPr>
-            <w:tcW w:type="dxa" w:w="4703"/>
-            <w:shd w:fill="f5f5f5" w:val="clear"/>
-          </w:tcPr>
-          <w:p>
-            <w:r>
-              <w:rPr>
-                <w:b/>
-              </w:rPr>
-              <w:t>Deployment Target</w:t>
-            </w:r>
-          </w:p>
-        </w:tc>
-        <w:tc>
-          <w:tcPr>
-            <w:tcW w:type="dxa" w:w="4703"/>
-            <w:shd w:fill="f5f5f5" w:val="clear"/>
-          </w:tcPr>
-          <w:p>
-            <w:r>
-              <w:t>Vercel (fisto-ecommerce.vercel.app)</w:t>
-            </w:r>
-          </w:p>
-        </w:tc>
-      </w:tr>
-    </w:tbl>
-    <w:p/>
-    <w:p>
-      <w:r>
-        <w:t>This project demonstrates a well-architected, modern e-commerce frontend with clean code organization, reusable components, proper state management, and attention to user experience details. It serves as an excellent foundation that could be extended with a real backend, database, payment processing (e.g., Stripe), and user authentication (e.g., NextAuth.js) to become a production-ready online store.</w:t>
-      </w:r>
-    </w:p>
-    <w:p>
-      <w:pPr>
-        <w:pBdr>
-          <w:bottom w:val="single" w:sz="6" w:space="1" w:color="999999"/>
-        </w:pBdr>
-      </w:pPr>
-    </w:p>
-    <w:p>
-      <w:pPr>
-        <w:jc w:val="center"/>
-      </w:pPr>
-      <w:r>
-        <w:rPr>
-          <w:i/>
-          <w:color w:val="999999"/>
-          <w:sz w:val="18"/>
-        </w:rPr>
-        <w:br/>
-        <w:t>Report generated on July 07, 2026 at 12:16</w:t>
+        <w:t>npm start</w:t>
       </w:r>
     </w:p>
     <w:sectPr>
       <w:pgSz w:w="12240" w:h="15840"/>
-      <w:pgMar w:top="1134" w:right="1417" w:bottom="1134" w:left="1417" w:header="720" w:footer="720" w:gutter="0"/>
+      <w:pgMar w:top="1440" w:right="1800" w:bottom="1440" w:left="1800" w:header="720" w:footer="720" w:gutter="0"/>
       <w:cols w:space="720"/>
       <w:docGrid w:linePitch="360"/>
     </w:sectPr>
@@ -4813,11 +1297,6 @@
     <w:name w:val="Normal"/>
     <w:qFormat/>
     <w:rsid w:val="00FC693F"/>
-    <w:rPr>
-      <w:rFonts w:ascii="Calibri" w:hAnsi="Calibri"/>
-      <w:color w:val="333333"/>
-      <w:sz w:val="22"/>
-    </w:rPr>
   </w:style>
   <w:style w:type="paragraph" w:styleId="Header">
     <w:name w:val="header"/>
@@ -4878,10 +1357,10 @@
       <w:outlineLvl w:val="0"/>
     </w:pPr>
     <w:rPr>
-      <w:rFonts w:asciiTheme="majorHAnsi" w:eastAsiaTheme="majorEastAsia" w:hAnsiTheme="majorHAnsi" w:cstheme="majorBidi" w:ascii="Calibri" w:hAnsi="Calibri"/>
+      <w:rFonts w:asciiTheme="majorHAnsi" w:eastAsiaTheme="majorEastAsia" w:hAnsiTheme="majorHAnsi" w:cstheme="majorBidi"/>
       <w:b/>
       <w:bCs/>
-      <w:color w:val="1A1A2E"/>
+      <w:color w:val="365F91" w:themeColor="accent1" w:themeShade="BF"/>
       <w:sz w:val="28"/>
       <w:szCs w:val="28"/>
     </w:rPr>
@@ -4902,10 +1381,10 @@
       <w:outlineLvl w:val="1"/>
     </w:pPr>
     <w:rPr>
-      <w:rFonts w:asciiTheme="majorHAnsi" w:eastAsiaTheme="majorEastAsia" w:hAnsiTheme="majorHAnsi" w:cstheme="majorBidi" w:ascii="Calibri" w:hAnsi="Calibri"/>
+      <w:rFonts w:asciiTheme="majorHAnsi" w:eastAsiaTheme="majorEastAsia" w:hAnsiTheme="majorHAnsi" w:cstheme="majorBidi"/>
       <w:b/>
       <w:bCs/>
-      <w:color w:val="1A1A2E"/>
+      <w:color w:val="4F81BD" w:themeColor="accent1"/>
       <w:sz w:val="26"/>
       <w:szCs w:val="26"/>
     </w:rPr>
@@ -4926,10 +1405,10 @@
       <w:outlineLvl w:val="2"/>
     </w:pPr>
     <w:rPr>
-      <w:rFonts w:asciiTheme="majorHAnsi" w:eastAsiaTheme="majorEastAsia" w:hAnsiTheme="majorHAnsi" w:cstheme="majorBidi" w:ascii="Calibri" w:hAnsi="Calibri"/>
+      <w:rFonts w:asciiTheme="majorHAnsi" w:eastAsiaTheme="majorEastAsia" w:hAnsiTheme="majorHAnsi" w:cstheme="majorBidi"/>
       <w:b/>
       <w:bCs/>
-      <w:color w:val="1A1A2E"/>
+      <w:color w:val="4F81BD" w:themeColor="accent1"/>
     </w:rPr>
   </w:style>
   <w:style w:type="paragraph" w:styleId="Heading4">

</xml_diff>